<commit_message>
Guion, CFA y .zip
</commit_message>
<xml_diff>
--- a/fuentes/CF3_63310033_DU.docx
+++ b/fuentes/CF3_63310033_DU.docx
@@ -1,6 +1,6 @@
 
 <file path=word/document.xml><?xml version="1.0" encoding="utf-8"?>
-<w:document xmlns:wpc="http://schemas.microsoft.com/office/word/2010/wordprocessingCanvas" xmlns:cx="http://schemas.microsoft.com/office/drawing/2014/chartex" xmlns:cx1="http://schemas.microsoft.com/office/drawing/2015/9/8/chartex" xmlns:cx2="http://schemas.microsoft.com/office/drawing/2015/10/21/chartex" xmlns:cx3="http://schemas.microsoft.com/office/drawing/2016/5/9/chartex" xmlns:cx4="http://schemas.microsoft.com/office/drawing/2016/5/10/chartex" xmlns:cx5="http://schemas.microsoft.com/office/drawing/2016/5/11/chartex" xmlns:cx6="http://schemas.microsoft.com/office/drawing/2016/5/12/chartex" xmlns:cx7="http://schemas.microsoft.com/office/drawing/2016/5/13/chartex" xmlns:cx8="http://schemas.microsoft.com/office/drawing/2016/5/14/chartex" xmlns:mc="http://schemas.openxmlformats.org/markup-compatibility/2006" xmlns:aink="http://schemas.microsoft.com/office/drawing/2016/ink" xmlns:am3d="http://schemas.microsoft.com/office/drawing/2017/model3d" xmlns:o="urn:schemas-microsoft-com:office:office" xmlns:r="http://schemas.openxmlformats.org/officeDocument/2006/relationships" xmlns:m="http://schemas.openxmlformats.org/officeDocument/2006/math" xmlns:v="urn:schemas-microsoft-com:vml" xmlns:wp14="http://schemas.microsoft.com/office/word/2010/wordprocessingDrawing" xmlns:wp="http://schemas.openxmlformats.org/drawingml/2006/wordprocessingDrawing" xmlns:w10="urn:schemas-microsoft-com:office:word" xmlns:w="http://schemas.openxmlformats.org/wordprocessingml/2006/main" xmlns:w14="http://schemas.microsoft.com/office/word/2010/wordml" xmlns:w15="http://schemas.microsoft.com/office/word/2012/wordml" xmlns:w16cex="http://schemas.microsoft.com/office/word/2018/wordml/cex" xmlns:w16cid="http://schemas.microsoft.com/office/word/2016/wordml/cid" xmlns:w16="http://schemas.microsoft.com/office/word/2018/wordml" xmlns:w16sdtdh="http://schemas.microsoft.com/office/word/2020/wordml/sdtdatahash" xmlns:w16se="http://schemas.microsoft.com/office/word/2015/wordml/symex" xmlns:wpg="http://schemas.microsoft.com/office/word/2010/wordprocessingGroup" xmlns:wpi="http://schemas.microsoft.com/office/word/2010/wordprocessingInk" xmlns:wne="http://schemas.microsoft.com/office/word/2006/wordml" xmlns:wps="http://schemas.microsoft.com/office/word/2010/wordprocessingShape" mc:Ignorable="w14 w15 w16se w16cid w16 w16cex w16sdtdh wp14">
+<w:document xmlns:wpc="http://schemas.microsoft.com/office/word/2010/wordprocessingCanvas" xmlns:cx="http://schemas.microsoft.com/office/drawing/2014/chartex" xmlns:cx1="http://schemas.microsoft.com/office/drawing/2015/9/8/chartex" xmlns:cx2="http://schemas.microsoft.com/office/drawing/2015/10/21/chartex" xmlns:cx3="http://schemas.microsoft.com/office/drawing/2016/5/9/chartex" xmlns:cx4="http://schemas.microsoft.com/office/drawing/2016/5/10/chartex" xmlns:cx5="http://schemas.microsoft.com/office/drawing/2016/5/11/chartex" xmlns:cx6="http://schemas.microsoft.com/office/drawing/2016/5/12/chartex" xmlns:cx7="http://schemas.microsoft.com/office/drawing/2016/5/13/chartex" xmlns:cx8="http://schemas.microsoft.com/office/drawing/2016/5/14/chartex" xmlns:mc="http://schemas.openxmlformats.org/markup-compatibility/2006" xmlns:aink="http://schemas.microsoft.com/office/drawing/2016/ink" xmlns:am3d="http://schemas.microsoft.com/office/drawing/2017/model3d" xmlns:o="urn:schemas-microsoft-com:office:office" xmlns:oel="http://schemas.microsoft.com/office/2019/extlst" xmlns:r="http://schemas.openxmlformats.org/officeDocument/2006/relationships" xmlns:m="http://schemas.openxmlformats.org/officeDocument/2006/math" xmlns:v="urn:schemas-microsoft-com:vml" xmlns:wp14="http://schemas.microsoft.com/office/word/2010/wordprocessingDrawing" xmlns:wp="http://schemas.openxmlformats.org/drawingml/2006/wordprocessingDrawing" xmlns:w10="urn:schemas-microsoft-com:office:word" xmlns:w="http://schemas.openxmlformats.org/wordprocessingml/2006/main" xmlns:w14="http://schemas.microsoft.com/office/word/2010/wordml" xmlns:w15="http://schemas.microsoft.com/office/word/2012/wordml" xmlns:w16cex="http://schemas.microsoft.com/office/word/2018/wordml/cex" xmlns:w16cid="http://schemas.microsoft.com/office/word/2016/wordml/cid" xmlns:w16="http://schemas.microsoft.com/office/word/2018/wordml" xmlns:w16du="http://schemas.microsoft.com/office/word/2023/wordml/word16du" xmlns:w16sdtdh="http://schemas.microsoft.com/office/word/2020/wordml/sdtdatahash" xmlns:w16sdtfl="http://schemas.microsoft.com/office/word/2024/wordml/sdtformatlock" xmlns:w16se="http://schemas.microsoft.com/office/word/2015/wordml/symex" xmlns:wpg="http://schemas.microsoft.com/office/word/2010/wordprocessingGroup" xmlns:wpi="http://schemas.microsoft.com/office/word/2010/wordprocessingInk" xmlns:wne="http://schemas.microsoft.com/office/word/2006/wordml" xmlns:wps="http://schemas.microsoft.com/office/word/2010/wordprocessingShape" mc:Ignorable="w14 w15 w16se w16cid w16 w16cex w16sdtdh w16sdtfl w16du wp14">
   <w:body>
     <w:p>
       <w:r>
@@ -2183,13 +2183,23 @@
           <w:lang w:eastAsia="es-CO"/>
         </w:rPr>
       </w:pPr>
-      <w:r>
-        <w:rPr>
-          <w:b/>
-          <w:bCs/>
-          <w:lang w:eastAsia="es-CO"/>
-        </w:rPr>
-        <w:t>Torrentismo:</w:t>
+      <w:proofErr w:type="spellStart"/>
+      <w:r>
+        <w:rPr>
+          <w:b/>
+          <w:bCs/>
+          <w:lang w:eastAsia="es-CO"/>
+        </w:rPr>
+        <w:t>Torrentismo</w:t>
+      </w:r>
+      <w:proofErr w:type="spellEnd"/>
+      <w:r>
+        <w:rPr>
+          <w:b/>
+          <w:bCs/>
+          <w:lang w:eastAsia="es-CO"/>
+        </w:rPr>
+        <w:t>:</w:t>
       </w:r>
       <w:r>
         <w:rPr>
@@ -2262,6 +2272,7 @@
           <w:lang w:eastAsia="es-CO"/>
         </w:rPr>
       </w:pPr>
+      <w:proofErr w:type="spellStart"/>
       <w:r>
         <w:rPr>
           <w:rStyle w:val="Extranjerismo"/>
@@ -2271,6 +2282,7 @@
         </w:rPr>
         <w:t>Trekking</w:t>
       </w:r>
+      <w:proofErr w:type="spellEnd"/>
       <w:r>
         <w:rPr>
           <w:b/>
@@ -3002,7 +3014,25 @@
           <w:bCs/>
           <w:lang w:eastAsia="es-CO"/>
         </w:rPr>
-        <w:t>Transformación hacia una monoeconomía:</w:t>
+        <w:t xml:space="preserve">Transformación hacia una </w:t>
+      </w:r>
+      <w:proofErr w:type="spellStart"/>
+      <w:r>
+        <w:rPr>
+          <w:b/>
+          <w:bCs/>
+          <w:lang w:eastAsia="es-CO"/>
+        </w:rPr>
+        <w:t>monoeconomía</w:t>
+      </w:r>
+      <w:proofErr w:type="spellEnd"/>
+      <w:r>
+        <w:rPr>
+          <w:b/>
+          <w:bCs/>
+          <w:lang w:eastAsia="es-CO"/>
+        </w:rPr>
+        <w:t>:</w:t>
       </w:r>
       <w:r>
         <w:rPr>
@@ -5165,12 +5195,16 @@
                 <w:ilvl w:val="0"/>
                 <w:numId w:val="48"/>
               </w:numPr>
+              <w:rPr>
+                <w:rFonts w:cs="Calibri"/>
+                <w:color w:val="000000" w:themeColor="text1"/>
+              </w:rPr>
             </w:pPr>
             <w:r>
               <w:rPr>
                 <w:rStyle w:val="mb-0"/>
-                <w:rFonts w:ascii="Roboto" w:hAnsi="Roboto"/>
-                <w:color w:val="12263F"/>
+                <w:rFonts w:cs="Calibri"/>
+                <w:color w:val="000000" w:themeColor="text1"/>
                 <w:bdr w:val="none" w:sz="0" w:space="0" w:color="auto" w:frame="1"/>
               </w:rPr>
               <w:lastRenderedPageBreak/>
@@ -5195,12 +5229,16 @@
                 <w:ilvl w:val="0"/>
                 <w:numId w:val="48"/>
               </w:numPr>
+              <w:rPr>
+                <w:rFonts w:cs="Calibri"/>
+                <w:color w:val="000000" w:themeColor="text1"/>
+              </w:rPr>
             </w:pPr>
             <w:r>
               <w:rPr>
                 <w:rStyle w:val="mb-0"/>
-                <w:rFonts w:ascii="Roboto" w:hAnsi="Roboto"/>
-                <w:color w:val="12263F"/>
+                <w:rFonts w:cs="Calibri"/>
+                <w:color w:val="000000" w:themeColor="text1"/>
                 <w:bdr w:val="none" w:sz="0" w:space="0" w:color="auto" w:frame="1"/>
               </w:rPr>
               <w:t>Sobreexplotación de la pesca</w:t>
@@ -6365,12 +6403,9 @@
           <w:lang w:eastAsia="es-CO"/>
           <w14:ligatures w14:val="none"/>
         </w:rPr>
-        <w:t>f). Código Mundial de Ética para el Turismo.</w:t>
-      </w:r>
-    </w:p>
-    <w:p>
-      <w:pPr>
-        <w:ind w:left="709" w:hanging="709"/>
+        <w:t>f</w:t>
+      </w:r>
+      <w:r>
         <w:rPr>
           <w:rFonts w:eastAsia="Times New Roman" w:cstheme="minorHAnsi"/>
           <w:kern w:val="0"/>
@@ -6379,7 +6414,8 @@
           <w:lang w:eastAsia="es-CO"/>
           <w14:ligatures w14:val="none"/>
         </w:rPr>
-      </w:pPr>
+        <w:t>.</w:t>
+      </w:r>
       <w:r>
         <w:rPr>
           <w:rFonts w:eastAsia="Times New Roman" w:cstheme="minorHAnsi"/>
@@ -6389,7 +6425,7 @@
           <w:lang w:eastAsia="es-CO"/>
           <w14:ligatures w14:val="none"/>
         </w:rPr>
-        <w:t>Organización Mundial del Turismo OMT. (s.f.). Entender el turismo: Glosario Básico.</w:t>
+        <w:t>). Código Mundial de Ética para el Turismo.</w:t>
       </w:r>
     </w:p>
     <w:p>
@@ -6413,7 +6449,7 @@
           <w:lang w:eastAsia="es-CO"/>
           <w14:ligatures w14:val="none"/>
         </w:rPr>
-        <w:t>SENA. (2011). TURISMO: HISTORIA, MORFOLOGÍA y TIPOLOGÍA.</w:t>
+        <w:t>Organización Mundial del Turismo OMT. (s.f.). Entender el turismo: Glosario Básico.</w:t>
       </w:r>
     </w:p>
     <w:p>
@@ -6437,7 +6473,55 @@
           <w:lang w:eastAsia="es-CO"/>
           <w14:ligatures w14:val="none"/>
         </w:rPr>
-        <w:t>SENA. (2017). Guianza Turística. Armenia</w:t>
+        <w:t>SENA. (2011). TURISMO: HISTORIA, MORFOLOGÍA y TIPOLOGÍA.</w:t>
+      </w:r>
+    </w:p>
+    <w:p>
+      <w:pPr>
+        <w:ind w:left="709" w:hanging="709"/>
+        <w:rPr>
+          <w:rFonts w:eastAsia="Times New Roman" w:cstheme="minorHAnsi"/>
+          <w:kern w:val="0"/>
+          <w:szCs w:val="28"/>
+          <w:bdr w:val="none" w:sz="0" w:space="0" w:color="auto" w:frame="1"/>
+          <w:lang w:eastAsia="es-CO"/>
+          <w14:ligatures w14:val="none"/>
+        </w:rPr>
+      </w:pPr>
+      <w:r>
+        <w:rPr>
+          <w:rFonts w:eastAsia="Times New Roman" w:cstheme="minorHAnsi"/>
+          <w:kern w:val="0"/>
+          <w:szCs w:val="28"/>
+          <w:bdr w:val="none" w:sz="0" w:space="0" w:color="auto" w:frame="1"/>
+          <w:lang w:eastAsia="es-CO"/>
+          <w14:ligatures w14:val="none"/>
+        </w:rPr>
+        <w:t xml:space="preserve">SENA. (2017). </w:t>
+      </w:r>
+      <w:proofErr w:type="spellStart"/>
+      <w:r>
+        <w:rPr>
+          <w:rFonts w:eastAsia="Times New Roman" w:cstheme="minorHAnsi"/>
+          <w:kern w:val="0"/>
+          <w:szCs w:val="28"/>
+          <w:bdr w:val="none" w:sz="0" w:space="0" w:color="auto" w:frame="1"/>
+          <w:lang w:eastAsia="es-CO"/>
+          <w14:ligatures w14:val="none"/>
+        </w:rPr>
+        <w:t>Guianza</w:t>
+      </w:r>
+      <w:proofErr w:type="spellEnd"/>
+      <w:r>
+        <w:rPr>
+          <w:rFonts w:eastAsia="Times New Roman" w:cstheme="minorHAnsi"/>
+          <w:kern w:val="0"/>
+          <w:szCs w:val="28"/>
+          <w:bdr w:val="none" w:sz="0" w:space="0" w:color="auto" w:frame="1"/>
+          <w:lang w:eastAsia="es-CO"/>
+          <w14:ligatures w14:val="none"/>
+        </w:rPr>
+        <w:t xml:space="preserve"> Turística. Armenia</w:t>
       </w:r>
       <w:r>
         <w:rPr>
@@ -6748,7 +6832,13 @@
               <w:pStyle w:val="TextoTablas"/>
             </w:pPr>
             <w:r>
-              <w:t>Evaluadora Instruccional</w:t>
+              <w:t xml:space="preserve">Evaluadora </w:t>
+            </w:r>
+            <w:r>
+              <w:t>i</w:t>
+            </w:r>
+            <w:r>
+              <w:t>nstruccional</w:t>
             </w:r>
           </w:p>
         </w:tc>
@@ -7023,7 +7113,7 @@
 </file>
 
 <file path=word/endnotes.xml><?xml version="1.0" encoding="utf-8"?>
-<w:endnotes xmlns:wpc="http://schemas.microsoft.com/office/word/2010/wordprocessingCanvas" xmlns:cx="http://schemas.microsoft.com/office/drawing/2014/chartex" xmlns:cx1="http://schemas.microsoft.com/office/drawing/2015/9/8/chartex" xmlns:cx2="http://schemas.microsoft.com/office/drawing/2015/10/21/chartex" xmlns:cx3="http://schemas.microsoft.com/office/drawing/2016/5/9/chartex" xmlns:cx4="http://schemas.microsoft.com/office/drawing/2016/5/10/chartex" xmlns:cx5="http://schemas.microsoft.com/office/drawing/2016/5/11/chartex" xmlns:cx6="http://schemas.microsoft.com/office/drawing/2016/5/12/chartex" xmlns:cx7="http://schemas.microsoft.com/office/drawing/2016/5/13/chartex" xmlns:cx8="http://schemas.microsoft.com/office/drawing/2016/5/14/chartex" xmlns:mc="http://schemas.openxmlformats.org/markup-compatibility/2006" xmlns:aink="http://schemas.microsoft.com/office/drawing/2016/ink" xmlns:am3d="http://schemas.microsoft.com/office/drawing/2017/model3d" xmlns:o="urn:schemas-microsoft-com:office:office" xmlns:r="http://schemas.openxmlformats.org/officeDocument/2006/relationships" xmlns:m="http://schemas.openxmlformats.org/officeDocument/2006/math" xmlns:v="urn:schemas-microsoft-com:vml" xmlns:wp14="http://schemas.microsoft.com/office/word/2010/wordprocessingDrawing" xmlns:wp="http://schemas.openxmlformats.org/drawingml/2006/wordprocessingDrawing" xmlns:w10="urn:schemas-microsoft-com:office:word" xmlns:w="http://schemas.openxmlformats.org/wordprocessingml/2006/main" xmlns:w14="http://schemas.microsoft.com/office/word/2010/wordml" xmlns:w15="http://schemas.microsoft.com/office/word/2012/wordml" xmlns:w16cex="http://schemas.microsoft.com/office/word/2018/wordml/cex" xmlns:w16cid="http://schemas.microsoft.com/office/word/2016/wordml/cid" xmlns:w16="http://schemas.microsoft.com/office/word/2018/wordml" xmlns:w16sdtdh="http://schemas.microsoft.com/office/word/2020/wordml/sdtdatahash" xmlns:w16se="http://schemas.microsoft.com/office/word/2015/wordml/symex" xmlns:wpg="http://schemas.microsoft.com/office/word/2010/wordprocessingGroup" xmlns:wpi="http://schemas.microsoft.com/office/word/2010/wordprocessingInk" xmlns:wne="http://schemas.microsoft.com/office/word/2006/wordml" xmlns:wps="http://schemas.microsoft.com/office/word/2010/wordprocessingShape" mc:Ignorable="w14 w15 w16se w16cid w16 w16cex w16sdtdh wp14">
+<w:endnotes xmlns:wpc="http://schemas.microsoft.com/office/word/2010/wordprocessingCanvas" xmlns:cx="http://schemas.microsoft.com/office/drawing/2014/chartex" xmlns:cx1="http://schemas.microsoft.com/office/drawing/2015/9/8/chartex" xmlns:cx2="http://schemas.microsoft.com/office/drawing/2015/10/21/chartex" xmlns:cx3="http://schemas.microsoft.com/office/drawing/2016/5/9/chartex" xmlns:cx4="http://schemas.microsoft.com/office/drawing/2016/5/10/chartex" xmlns:cx5="http://schemas.microsoft.com/office/drawing/2016/5/11/chartex" xmlns:cx6="http://schemas.microsoft.com/office/drawing/2016/5/12/chartex" xmlns:cx7="http://schemas.microsoft.com/office/drawing/2016/5/13/chartex" xmlns:cx8="http://schemas.microsoft.com/office/drawing/2016/5/14/chartex" xmlns:mc="http://schemas.openxmlformats.org/markup-compatibility/2006" xmlns:aink="http://schemas.microsoft.com/office/drawing/2016/ink" xmlns:am3d="http://schemas.microsoft.com/office/drawing/2017/model3d" xmlns:o="urn:schemas-microsoft-com:office:office" xmlns:oel="http://schemas.microsoft.com/office/2019/extlst" xmlns:r="http://schemas.openxmlformats.org/officeDocument/2006/relationships" xmlns:m="http://schemas.openxmlformats.org/officeDocument/2006/math" xmlns:v="urn:schemas-microsoft-com:vml" xmlns:wp14="http://schemas.microsoft.com/office/word/2010/wordprocessingDrawing" xmlns:wp="http://schemas.openxmlformats.org/drawingml/2006/wordprocessingDrawing" xmlns:w10="urn:schemas-microsoft-com:office:word" xmlns:w="http://schemas.openxmlformats.org/wordprocessingml/2006/main" xmlns:w14="http://schemas.microsoft.com/office/word/2010/wordml" xmlns:w15="http://schemas.microsoft.com/office/word/2012/wordml" xmlns:w16cex="http://schemas.microsoft.com/office/word/2018/wordml/cex" xmlns:w16cid="http://schemas.microsoft.com/office/word/2016/wordml/cid" xmlns:w16="http://schemas.microsoft.com/office/word/2018/wordml" xmlns:w16du="http://schemas.microsoft.com/office/word/2023/wordml/word16du" xmlns:w16sdtdh="http://schemas.microsoft.com/office/word/2020/wordml/sdtdatahash" xmlns:w16sdtfl="http://schemas.microsoft.com/office/word/2024/wordml/sdtformatlock" xmlns:w16se="http://schemas.microsoft.com/office/word/2015/wordml/symex" xmlns:wpg="http://schemas.microsoft.com/office/word/2010/wordprocessingGroup" xmlns:wpi="http://schemas.microsoft.com/office/word/2010/wordprocessingInk" xmlns:wne="http://schemas.microsoft.com/office/word/2006/wordml" xmlns:wps="http://schemas.microsoft.com/office/word/2010/wordprocessingShape" mc:Ignorable="w14 w15 w16se w16cid w16 w16cex w16sdtdh w16sdtfl w16du wp14">
   <w:endnote w:type="separator" w:id="-1">
     <w:p>
       <w:pPr>
@@ -7048,7 +7138,7 @@
 </file>
 
 <file path=word/footer1.xml><?xml version="1.0" encoding="utf-8"?>
-<w:ftr xmlns:wpc="http://schemas.microsoft.com/office/word/2010/wordprocessingCanvas" xmlns:cx="http://schemas.microsoft.com/office/drawing/2014/chartex" xmlns:cx1="http://schemas.microsoft.com/office/drawing/2015/9/8/chartex" xmlns:cx2="http://schemas.microsoft.com/office/drawing/2015/10/21/chartex" xmlns:cx3="http://schemas.microsoft.com/office/drawing/2016/5/9/chartex" xmlns:cx4="http://schemas.microsoft.com/office/drawing/2016/5/10/chartex" xmlns:cx5="http://schemas.microsoft.com/office/drawing/2016/5/11/chartex" xmlns:cx6="http://schemas.microsoft.com/office/drawing/2016/5/12/chartex" xmlns:cx7="http://schemas.microsoft.com/office/drawing/2016/5/13/chartex" xmlns:cx8="http://schemas.microsoft.com/office/drawing/2016/5/14/chartex" xmlns:mc="http://schemas.openxmlformats.org/markup-compatibility/2006" xmlns:aink="http://schemas.microsoft.com/office/drawing/2016/ink" xmlns:am3d="http://schemas.microsoft.com/office/drawing/2017/model3d" xmlns:o="urn:schemas-microsoft-com:office:office" xmlns:r="http://schemas.openxmlformats.org/officeDocument/2006/relationships" xmlns:m="http://schemas.openxmlformats.org/officeDocument/2006/math" xmlns:v="urn:schemas-microsoft-com:vml" xmlns:wp14="http://schemas.microsoft.com/office/word/2010/wordprocessingDrawing" xmlns:wp="http://schemas.openxmlformats.org/drawingml/2006/wordprocessingDrawing" xmlns:w10="urn:schemas-microsoft-com:office:word" xmlns:w="http://schemas.openxmlformats.org/wordprocessingml/2006/main" xmlns:w14="http://schemas.microsoft.com/office/word/2010/wordml" xmlns:w15="http://schemas.microsoft.com/office/word/2012/wordml" xmlns:w16cex="http://schemas.microsoft.com/office/word/2018/wordml/cex" xmlns:w16cid="http://schemas.microsoft.com/office/word/2016/wordml/cid" xmlns:w16="http://schemas.microsoft.com/office/word/2018/wordml" xmlns:w16sdtdh="http://schemas.microsoft.com/office/word/2020/wordml/sdtdatahash" xmlns:w16se="http://schemas.microsoft.com/office/word/2015/wordml/symex" xmlns:wpg="http://schemas.microsoft.com/office/word/2010/wordprocessingGroup" xmlns:wpi="http://schemas.microsoft.com/office/word/2010/wordprocessingInk" xmlns:wne="http://schemas.microsoft.com/office/word/2006/wordml" xmlns:wps="http://schemas.microsoft.com/office/word/2010/wordprocessingShape" mc:Ignorable="w14 w15 w16se w16cid w16 w16cex w16sdtdh wp14">
+<w:ftr xmlns:wpc="http://schemas.microsoft.com/office/word/2010/wordprocessingCanvas" xmlns:cx="http://schemas.microsoft.com/office/drawing/2014/chartex" xmlns:cx1="http://schemas.microsoft.com/office/drawing/2015/9/8/chartex" xmlns:cx2="http://schemas.microsoft.com/office/drawing/2015/10/21/chartex" xmlns:cx3="http://schemas.microsoft.com/office/drawing/2016/5/9/chartex" xmlns:cx4="http://schemas.microsoft.com/office/drawing/2016/5/10/chartex" xmlns:cx5="http://schemas.microsoft.com/office/drawing/2016/5/11/chartex" xmlns:cx6="http://schemas.microsoft.com/office/drawing/2016/5/12/chartex" xmlns:cx7="http://schemas.microsoft.com/office/drawing/2016/5/13/chartex" xmlns:cx8="http://schemas.microsoft.com/office/drawing/2016/5/14/chartex" xmlns:mc="http://schemas.openxmlformats.org/markup-compatibility/2006" xmlns:aink="http://schemas.microsoft.com/office/drawing/2016/ink" xmlns:am3d="http://schemas.microsoft.com/office/drawing/2017/model3d" xmlns:o="urn:schemas-microsoft-com:office:office" xmlns:oel="http://schemas.microsoft.com/office/2019/extlst" xmlns:r="http://schemas.openxmlformats.org/officeDocument/2006/relationships" xmlns:m="http://schemas.openxmlformats.org/officeDocument/2006/math" xmlns:v="urn:schemas-microsoft-com:vml" xmlns:wp14="http://schemas.microsoft.com/office/word/2010/wordprocessingDrawing" xmlns:wp="http://schemas.openxmlformats.org/drawingml/2006/wordprocessingDrawing" xmlns:w10="urn:schemas-microsoft-com:office:word" xmlns:w="http://schemas.openxmlformats.org/wordprocessingml/2006/main" xmlns:w14="http://schemas.microsoft.com/office/word/2010/wordml" xmlns:w15="http://schemas.microsoft.com/office/word/2012/wordml" xmlns:w16cex="http://schemas.microsoft.com/office/word/2018/wordml/cex" xmlns:w16cid="http://schemas.microsoft.com/office/word/2016/wordml/cid" xmlns:w16="http://schemas.microsoft.com/office/word/2018/wordml" xmlns:w16du="http://schemas.microsoft.com/office/word/2023/wordml/word16du" xmlns:w16sdtdh="http://schemas.microsoft.com/office/word/2020/wordml/sdtdatahash" xmlns:w16sdtfl="http://schemas.microsoft.com/office/word/2024/wordml/sdtformatlock" xmlns:w16se="http://schemas.microsoft.com/office/word/2015/wordml/symex" xmlns:wpg="http://schemas.microsoft.com/office/word/2010/wordprocessingGroup" xmlns:wpi="http://schemas.microsoft.com/office/word/2010/wordprocessingInk" xmlns:wne="http://schemas.microsoft.com/office/word/2006/wordml" xmlns:wps="http://schemas.microsoft.com/office/word/2010/wordprocessingShape" mc:Ignorable="w14 w15 w16se w16cid w16 w16cex w16sdtdh w16sdtfl w16du wp14">
   <w:p>
     <w:pPr>
       <w:pStyle w:val="Piedepgina"/>
@@ -7058,7 +7148,7 @@
 </file>
 
 <file path=word/footer2.xml><?xml version="1.0" encoding="utf-8"?>
-<w:ftr xmlns:wpc="http://schemas.microsoft.com/office/word/2010/wordprocessingCanvas" xmlns:cx="http://schemas.microsoft.com/office/drawing/2014/chartex" xmlns:cx1="http://schemas.microsoft.com/office/drawing/2015/9/8/chartex" xmlns:cx2="http://schemas.microsoft.com/office/drawing/2015/10/21/chartex" xmlns:cx3="http://schemas.microsoft.com/office/drawing/2016/5/9/chartex" xmlns:cx4="http://schemas.microsoft.com/office/drawing/2016/5/10/chartex" xmlns:cx5="http://schemas.microsoft.com/office/drawing/2016/5/11/chartex" xmlns:cx6="http://schemas.microsoft.com/office/drawing/2016/5/12/chartex" xmlns:cx7="http://schemas.microsoft.com/office/drawing/2016/5/13/chartex" xmlns:cx8="http://schemas.microsoft.com/office/drawing/2016/5/14/chartex" xmlns:mc="http://schemas.openxmlformats.org/markup-compatibility/2006" xmlns:aink="http://schemas.microsoft.com/office/drawing/2016/ink" xmlns:am3d="http://schemas.microsoft.com/office/drawing/2017/model3d" xmlns:o="urn:schemas-microsoft-com:office:office" xmlns:r="http://schemas.openxmlformats.org/officeDocument/2006/relationships" xmlns:m="http://schemas.openxmlformats.org/officeDocument/2006/math" xmlns:v="urn:schemas-microsoft-com:vml" xmlns:wp14="http://schemas.microsoft.com/office/word/2010/wordprocessingDrawing" xmlns:wp="http://schemas.openxmlformats.org/drawingml/2006/wordprocessingDrawing" xmlns:w10="urn:schemas-microsoft-com:office:word" xmlns:w="http://schemas.openxmlformats.org/wordprocessingml/2006/main" xmlns:w14="http://schemas.microsoft.com/office/word/2010/wordml" xmlns:w15="http://schemas.microsoft.com/office/word/2012/wordml" xmlns:w16cex="http://schemas.microsoft.com/office/word/2018/wordml/cex" xmlns:w16cid="http://schemas.microsoft.com/office/word/2016/wordml/cid" xmlns:w16="http://schemas.microsoft.com/office/word/2018/wordml" xmlns:w16sdtdh="http://schemas.microsoft.com/office/word/2020/wordml/sdtdatahash" xmlns:w16se="http://schemas.microsoft.com/office/word/2015/wordml/symex" xmlns:wpg="http://schemas.microsoft.com/office/word/2010/wordprocessingGroup" xmlns:wpi="http://schemas.microsoft.com/office/word/2010/wordprocessingInk" xmlns:wne="http://schemas.microsoft.com/office/word/2006/wordml" xmlns:wps="http://schemas.microsoft.com/office/word/2010/wordprocessingShape" mc:Ignorable="w14 w15 w16se w16cid w16 w16cex w16sdtdh wp14">
+<w:ftr xmlns:wpc="http://schemas.microsoft.com/office/word/2010/wordprocessingCanvas" xmlns:cx="http://schemas.microsoft.com/office/drawing/2014/chartex" xmlns:cx1="http://schemas.microsoft.com/office/drawing/2015/9/8/chartex" xmlns:cx2="http://schemas.microsoft.com/office/drawing/2015/10/21/chartex" xmlns:cx3="http://schemas.microsoft.com/office/drawing/2016/5/9/chartex" xmlns:cx4="http://schemas.microsoft.com/office/drawing/2016/5/10/chartex" xmlns:cx5="http://schemas.microsoft.com/office/drawing/2016/5/11/chartex" xmlns:cx6="http://schemas.microsoft.com/office/drawing/2016/5/12/chartex" xmlns:cx7="http://schemas.microsoft.com/office/drawing/2016/5/13/chartex" xmlns:cx8="http://schemas.microsoft.com/office/drawing/2016/5/14/chartex" xmlns:mc="http://schemas.openxmlformats.org/markup-compatibility/2006" xmlns:aink="http://schemas.microsoft.com/office/drawing/2016/ink" xmlns:am3d="http://schemas.microsoft.com/office/drawing/2017/model3d" xmlns:o="urn:schemas-microsoft-com:office:office" xmlns:oel="http://schemas.microsoft.com/office/2019/extlst" xmlns:r="http://schemas.openxmlformats.org/officeDocument/2006/relationships" xmlns:m="http://schemas.openxmlformats.org/officeDocument/2006/math" xmlns:v="urn:schemas-microsoft-com:vml" xmlns:wp14="http://schemas.microsoft.com/office/word/2010/wordprocessingDrawing" xmlns:wp="http://schemas.openxmlformats.org/drawingml/2006/wordprocessingDrawing" xmlns:w10="urn:schemas-microsoft-com:office:word" xmlns:w="http://schemas.openxmlformats.org/wordprocessingml/2006/main" xmlns:w14="http://schemas.microsoft.com/office/word/2010/wordml" xmlns:w15="http://schemas.microsoft.com/office/word/2012/wordml" xmlns:w16cex="http://schemas.microsoft.com/office/word/2018/wordml/cex" xmlns:w16cid="http://schemas.microsoft.com/office/word/2016/wordml/cid" xmlns:w16="http://schemas.microsoft.com/office/word/2018/wordml" xmlns:w16du="http://schemas.microsoft.com/office/word/2023/wordml/word16du" xmlns:w16sdtdh="http://schemas.microsoft.com/office/word/2020/wordml/sdtdatahash" xmlns:w16sdtfl="http://schemas.microsoft.com/office/word/2024/wordml/sdtformatlock" xmlns:w16se="http://schemas.microsoft.com/office/word/2015/wordml/symex" xmlns:wpg="http://schemas.microsoft.com/office/word/2010/wordprocessingGroup" xmlns:wpi="http://schemas.microsoft.com/office/word/2010/wordprocessingInk" xmlns:wne="http://schemas.microsoft.com/office/word/2006/wordml" xmlns:wps="http://schemas.microsoft.com/office/word/2010/wordprocessingShape" mc:Ignorable="w14 w15 w16se w16cid w16 w16cex w16sdtdh w16sdtfl w16du wp14">
   <w:sdt>
     <w:sdtPr>
       <w:id w:val="111017779"/>
@@ -7067,7 +7157,6 @@
         <w:docPartUnique/>
       </w:docPartObj>
     </w:sdtPr>
-    <w:sdtEndPr/>
     <w:sdtContent>
       <w:p>
         <w:pPr>
@@ -7086,7 +7175,7 @@
 </file>
 
 <file path=word/footer3.xml><?xml version="1.0" encoding="utf-8"?>
-<w:ftr xmlns:wpc="http://schemas.microsoft.com/office/word/2010/wordprocessingCanvas" xmlns:cx="http://schemas.microsoft.com/office/drawing/2014/chartex" xmlns:cx1="http://schemas.microsoft.com/office/drawing/2015/9/8/chartex" xmlns:cx2="http://schemas.microsoft.com/office/drawing/2015/10/21/chartex" xmlns:cx3="http://schemas.microsoft.com/office/drawing/2016/5/9/chartex" xmlns:cx4="http://schemas.microsoft.com/office/drawing/2016/5/10/chartex" xmlns:cx5="http://schemas.microsoft.com/office/drawing/2016/5/11/chartex" xmlns:cx6="http://schemas.microsoft.com/office/drawing/2016/5/12/chartex" xmlns:cx7="http://schemas.microsoft.com/office/drawing/2016/5/13/chartex" xmlns:cx8="http://schemas.microsoft.com/office/drawing/2016/5/14/chartex" xmlns:mc="http://schemas.openxmlformats.org/markup-compatibility/2006" xmlns:aink="http://schemas.microsoft.com/office/drawing/2016/ink" xmlns:am3d="http://schemas.microsoft.com/office/drawing/2017/model3d" xmlns:o="urn:schemas-microsoft-com:office:office" xmlns:r="http://schemas.openxmlformats.org/officeDocument/2006/relationships" xmlns:m="http://schemas.openxmlformats.org/officeDocument/2006/math" xmlns:v="urn:schemas-microsoft-com:vml" xmlns:wp14="http://schemas.microsoft.com/office/word/2010/wordprocessingDrawing" xmlns:wp="http://schemas.openxmlformats.org/drawingml/2006/wordprocessingDrawing" xmlns:w10="urn:schemas-microsoft-com:office:word" xmlns:w="http://schemas.openxmlformats.org/wordprocessingml/2006/main" xmlns:w14="http://schemas.microsoft.com/office/word/2010/wordml" xmlns:w15="http://schemas.microsoft.com/office/word/2012/wordml" xmlns:w16cex="http://schemas.microsoft.com/office/word/2018/wordml/cex" xmlns:w16cid="http://schemas.microsoft.com/office/word/2016/wordml/cid" xmlns:w16="http://schemas.microsoft.com/office/word/2018/wordml" xmlns:w16sdtdh="http://schemas.microsoft.com/office/word/2020/wordml/sdtdatahash" xmlns:w16se="http://schemas.microsoft.com/office/word/2015/wordml/symex" xmlns:wpg="http://schemas.microsoft.com/office/word/2010/wordprocessingGroup" xmlns:wpi="http://schemas.microsoft.com/office/word/2010/wordprocessingInk" xmlns:wne="http://schemas.microsoft.com/office/word/2006/wordml" xmlns:wps="http://schemas.microsoft.com/office/word/2010/wordprocessingShape" mc:Ignorable="w14 w15 w16se w16cid w16 w16cex w16sdtdh wp14">
+<w:ftr xmlns:wpc="http://schemas.microsoft.com/office/word/2010/wordprocessingCanvas" xmlns:cx="http://schemas.microsoft.com/office/drawing/2014/chartex" xmlns:cx1="http://schemas.microsoft.com/office/drawing/2015/9/8/chartex" xmlns:cx2="http://schemas.microsoft.com/office/drawing/2015/10/21/chartex" xmlns:cx3="http://schemas.microsoft.com/office/drawing/2016/5/9/chartex" xmlns:cx4="http://schemas.microsoft.com/office/drawing/2016/5/10/chartex" xmlns:cx5="http://schemas.microsoft.com/office/drawing/2016/5/11/chartex" xmlns:cx6="http://schemas.microsoft.com/office/drawing/2016/5/12/chartex" xmlns:cx7="http://schemas.microsoft.com/office/drawing/2016/5/13/chartex" xmlns:cx8="http://schemas.microsoft.com/office/drawing/2016/5/14/chartex" xmlns:mc="http://schemas.openxmlformats.org/markup-compatibility/2006" xmlns:aink="http://schemas.microsoft.com/office/drawing/2016/ink" xmlns:am3d="http://schemas.microsoft.com/office/drawing/2017/model3d" xmlns:o="urn:schemas-microsoft-com:office:office" xmlns:oel="http://schemas.microsoft.com/office/2019/extlst" xmlns:r="http://schemas.openxmlformats.org/officeDocument/2006/relationships" xmlns:m="http://schemas.openxmlformats.org/officeDocument/2006/math" xmlns:v="urn:schemas-microsoft-com:vml" xmlns:wp14="http://schemas.microsoft.com/office/word/2010/wordprocessingDrawing" xmlns:wp="http://schemas.openxmlformats.org/drawingml/2006/wordprocessingDrawing" xmlns:w10="urn:schemas-microsoft-com:office:word" xmlns:w="http://schemas.openxmlformats.org/wordprocessingml/2006/main" xmlns:w14="http://schemas.microsoft.com/office/word/2010/wordml" xmlns:w15="http://schemas.microsoft.com/office/word/2012/wordml" xmlns:w16cex="http://schemas.microsoft.com/office/word/2018/wordml/cex" xmlns:w16cid="http://schemas.microsoft.com/office/word/2016/wordml/cid" xmlns:w16="http://schemas.microsoft.com/office/word/2018/wordml" xmlns:w16du="http://schemas.microsoft.com/office/word/2023/wordml/word16du" xmlns:w16sdtdh="http://schemas.microsoft.com/office/word/2020/wordml/sdtdatahash" xmlns:w16sdtfl="http://schemas.microsoft.com/office/word/2024/wordml/sdtformatlock" xmlns:w16se="http://schemas.microsoft.com/office/word/2015/wordml/symex" xmlns:wpg="http://schemas.microsoft.com/office/word/2010/wordprocessingGroup" xmlns:wpi="http://schemas.microsoft.com/office/word/2010/wordprocessingInk" xmlns:wne="http://schemas.microsoft.com/office/word/2006/wordml" xmlns:wps="http://schemas.microsoft.com/office/word/2010/wordprocessingShape" mc:Ignorable="w14 w15 w16se w16cid w16 w16cex w16sdtdh w16sdtfl w16du wp14">
   <w:p>
     <w:pPr>
       <w:pStyle w:val="Piedepgina"/>
@@ -7096,7 +7185,7 @@
 </file>
 
 <file path=word/footer4.xml><?xml version="1.0" encoding="utf-8"?>
-<w:ftr xmlns:wpc="http://schemas.microsoft.com/office/word/2010/wordprocessingCanvas" xmlns:cx="http://schemas.microsoft.com/office/drawing/2014/chartex" xmlns:cx1="http://schemas.microsoft.com/office/drawing/2015/9/8/chartex" xmlns:cx2="http://schemas.microsoft.com/office/drawing/2015/10/21/chartex" xmlns:cx3="http://schemas.microsoft.com/office/drawing/2016/5/9/chartex" xmlns:cx4="http://schemas.microsoft.com/office/drawing/2016/5/10/chartex" xmlns:cx5="http://schemas.microsoft.com/office/drawing/2016/5/11/chartex" xmlns:cx6="http://schemas.microsoft.com/office/drawing/2016/5/12/chartex" xmlns:cx7="http://schemas.microsoft.com/office/drawing/2016/5/13/chartex" xmlns:cx8="http://schemas.microsoft.com/office/drawing/2016/5/14/chartex" xmlns:mc="http://schemas.openxmlformats.org/markup-compatibility/2006" xmlns:aink="http://schemas.microsoft.com/office/drawing/2016/ink" xmlns:am3d="http://schemas.microsoft.com/office/drawing/2017/model3d" xmlns:o="urn:schemas-microsoft-com:office:office" xmlns:r="http://schemas.openxmlformats.org/officeDocument/2006/relationships" xmlns:m="http://schemas.openxmlformats.org/officeDocument/2006/math" xmlns:v="urn:schemas-microsoft-com:vml" xmlns:wp14="http://schemas.microsoft.com/office/word/2010/wordprocessingDrawing" xmlns:wp="http://schemas.openxmlformats.org/drawingml/2006/wordprocessingDrawing" xmlns:w10="urn:schemas-microsoft-com:office:word" xmlns:w="http://schemas.openxmlformats.org/wordprocessingml/2006/main" xmlns:w14="http://schemas.microsoft.com/office/word/2010/wordml" xmlns:w15="http://schemas.microsoft.com/office/word/2012/wordml" xmlns:w16cex="http://schemas.microsoft.com/office/word/2018/wordml/cex" xmlns:w16cid="http://schemas.microsoft.com/office/word/2016/wordml/cid" xmlns:w16="http://schemas.microsoft.com/office/word/2018/wordml" xmlns:w16sdtdh="http://schemas.microsoft.com/office/word/2020/wordml/sdtdatahash" xmlns:w16se="http://schemas.microsoft.com/office/word/2015/wordml/symex" xmlns:wpg="http://schemas.microsoft.com/office/word/2010/wordprocessingGroup" xmlns:wpi="http://schemas.microsoft.com/office/word/2010/wordprocessingInk" xmlns:wne="http://schemas.microsoft.com/office/word/2006/wordml" xmlns:wps="http://schemas.microsoft.com/office/word/2010/wordprocessingShape" mc:Ignorable="w14 w15 w16se w16cid w16 w16cex w16sdtdh wp14">
+<w:ftr xmlns:wpc="http://schemas.microsoft.com/office/word/2010/wordprocessingCanvas" xmlns:cx="http://schemas.microsoft.com/office/drawing/2014/chartex" xmlns:cx1="http://schemas.microsoft.com/office/drawing/2015/9/8/chartex" xmlns:cx2="http://schemas.microsoft.com/office/drawing/2015/10/21/chartex" xmlns:cx3="http://schemas.microsoft.com/office/drawing/2016/5/9/chartex" xmlns:cx4="http://schemas.microsoft.com/office/drawing/2016/5/10/chartex" xmlns:cx5="http://schemas.microsoft.com/office/drawing/2016/5/11/chartex" xmlns:cx6="http://schemas.microsoft.com/office/drawing/2016/5/12/chartex" xmlns:cx7="http://schemas.microsoft.com/office/drawing/2016/5/13/chartex" xmlns:cx8="http://schemas.microsoft.com/office/drawing/2016/5/14/chartex" xmlns:mc="http://schemas.openxmlformats.org/markup-compatibility/2006" xmlns:aink="http://schemas.microsoft.com/office/drawing/2016/ink" xmlns:am3d="http://schemas.microsoft.com/office/drawing/2017/model3d" xmlns:o="urn:schemas-microsoft-com:office:office" xmlns:oel="http://schemas.microsoft.com/office/2019/extlst" xmlns:r="http://schemas.openxmlformats.org/officeDocument/2006/relationships" xmlns:m="http://schemas.openxmlformats.org/officeDocument/2006/math" xmlns:v="urn:schemas-microsoft-com:vml" xmlns:wp14="http://schemas.microsoft.com/office/word/2010/wordprocessingDrawing" xmlns:wp="http://schemas.openxmlformats.org/drawingml/2006/wordprocessingDrawing" xmlns:w10="urn:schemas-microsoft-com:office:word" xmlns:w="http://schemas.openxmlformats.org/wordprocessingml/2006/main" xmlns:w14="http://schemas.microsoft.com/office/word/2010/wordml" xmlns:w15="http://schemas.microsoft.com/office/word/2012/wordml" xmlns:w16cex="http://schemas.microsoft.com/office/word/2018/wordml/cex" xmlns:w16cid="http://schemas.microsoft.com/office/word/2016/wordml/cid" xmlns:w16="http://schemas.microsoft.com/office/word/2018/wordml" xmlns:w16du="http://schemas.microsoft.com/office/word/2023/wordml/word16du" xmlns:w16sdtdh="http://schemas.microsoft.com/office/word/2020/wordml/sdtdatahash" xmlns:w16sdtfl="http://schemas.microsoft.com/office/word/2024/wordml/sdtformatlock" xmlns:w16se="http://schemas.microsoft.com/office/word/2015/wordml/symex" xmlns:wpg="http://schemas.microsoft.com/office/word/2010/wordprocessingGroup" xmlns:wpi="http://schemas.microsoft.com/office/word/2010/wordprocessingInk" xmlns:wne="http://schemas.microsoft.com/office/word/2006/wordml" xmlns:wps="http://schemas.microsoft.com/office/word/2010/wordprocessingShape" mc:Ignorable="w14 w15 w16se w16cid w16 w16cex w16sdtdh w16sdtfl w16du wp14">
   <w:sdt>
     <w:sdtPr>
       <w:id w:val="-1465197936"/>
@@ -7105,7 +7194,6 @@
         <w:docPartUnique/>
       </w:docPartObj>
     </w:sdtPr>
-    <w:sdtEndPr/>
     <w:sdtContent>
       <w:p>
         <w:pPr>
@@ -7251,7 +7339,7 @@
 </file>
 
 <file path=word/footnotes.xml><?xml version="1.0" encoding="utf-8"?>
-<w:footnotes xmlns:wpc="http://schemas.microsoft.com/office/word/2010/wordprocessingCanvas" xmlns:cx="http://schemas.microsoft.com/office/drawing/2014/chartex" xmlns:cx1="http://schemas.microsoft.com/office/drawing/2015/9/8/chartex" xmlns:cx2="http://schemas.microsoft.com/office/drawing/2015/10/21/chartex" xmlns:cx3="http://schemas.microsoft.com/office/drawing/2016/5/9/chartex" xmlns:cx4="http://schemas.microsoft.com/office/drawing/2016/5/10/chartex" xmlns:cx5="http://schemas.microsoft.com/office/drawing/2016/5/11/chartex" xmlns:cx6="http://schemas.microsoft.com/office/drawing/2016/5/12/chartex" xmlns:cx7="http://schemas.microsoft.com/office/drawing/2016/5/13/chartex" xmlns:cx8="http://schemas.microsoft.com/office/drawing/2016/5/14/chartex" xmlns:mc="http://schemas.openxmlformats.org/markup-compatibility/2006" xmlns:aink="http://schemas.microsoft.com/office/drawing/2016/ink" xmlns:am3d="http://schemas.microsoft.com/office/drawing/2017/model3d" xmlns:o="urn:schemas-microsoft-com:office:office" xmlns:r="http://schemas.openxmlformats.org/officeDocument/2006/relationships" xmlns:m="http://schemas.openxmlformats.org/officeDocument/2006/math" xmlns:v="urn:schemas-microsoft-com:vml" xmlns:wp14="http://schemas.microsoft.com/office/word/2010/wordprocessingDrawing" xmlns:wp="http://schemas.openxmlformats.org/drawingml/2006/wordprocessingDrawing" xmlns:w10="urn:schemas-microsoft-com:office:word" xmlns:w="http://schemas.openxmlformats.org/wordprocessingml/2006/main" xmlns:w14="http://schemas.microsoft.com/office/word/2010/wordml" xmlns:w15="http://schemas.microsoft.com/office/word/2012/wordml" xmlns:w16cex="http://schemas.microsoft.com/office/word/2018/wordml/cex" xmlns:w16cid="http://schemas.microsoft.com/office/word/2016/wordml/cid" xmlns:w16="http://schemas.microsoft.com/office/word/2018/wordml" xmlns:w16sdtdh="http://schemas.microsoft.com/office/word/2020/wordml/sdtdatahash" xmlns:w16se="http://schemas.microsoft.com/office/word/2015/wordml/symex" xmlns:wpg="http://schemas.microsoft.com/office/word/2010/wordprocessingGroup" xmlns:wpi="http://schemas.microsoft.com/office/word/2010/wordprocessingInk" xmlns:wne="http://schemas.microsoft.com/office/word/2006/wordml" xmlns:wps="http://schemas.microsoft.com/office/word/2010/wordprocessingShape" mc:Ignorable="w14 w15 w16se w16cid w16 w16cex w16sdtdh wp14">
+<w:footnotes xmlns:wpc="http://schemas.microsoft.com/office/word/2010/wordprocessingCanvas" xmlns:cx="http://schemas.microsoft.com/office/drawing/2014/chartex" xmlns:cx1="http://schemas.microsoft.com/office/drawing/2015/9/8/chartex" xmlns:cx2="http://schemas.microsoft.com/office/drawing/2015/10/21/chartex" xmlns:cx3="http://schemas.microsoft.com/office/drawing/2016/5/9/chartex" xmlns:cx4="http://schemas.microsoft.com/office/drawing/2016/5/10/chartex" xmlns:cx5="http://schemas.microsoft.com/office/drawing/2016/5/11/chartex" xmlns:cx6="http://schemas.microsoft.com/office/drawing/2016/5/12/chartex" xmlns:cx7="http://schemas.microsoft.com/office/drawing/2016/5/13/chartex" xmlns:cx8="http://schemas.microsoft.com/office/drawing/2016/5/14/chartex" xmlns:mc="http://schemas.openxmlformats.org/markup-compatibility/2006" xmlns:aink="http://schemas.microsoft.com/office/drawing/2016/ink" xmlns:am3d="http://schemas.microsoft.com/office/drawing/2017/model3d" xmlns:o="urn:schemas-microsoft-com:office:office" xmlns:oel="http://schemas.microsoft.com/office/2019/extlst" xmlns:r="http://schemas.openxmlformats.org/officeDocument/2006/relationships" xmlns:m="http://schemas.openxmlformats.org/officeDocument/2006/math" xmlns:v="urn:schemas-microsoft-com:vml" xmlns:wp14="http://schemas.microsoft.com/office/word/2010/wordprocessingDrawing" xmlns:wp="http://schemas.openxmlformats.org/drawingml/2006/wordprocessingDrawing" xmlns:w10="urn:schemas-microsoft-com:office:word" xmlns:w="http://schemas.openxmlformats.org/wordprocessingml/2006/main" xmlns:w14="http://schemas.microsoft.com/office/word/2010/wordml" xmlns:w15="http://schemas.microsoft.com/office/word/2012/wordml" xmlns:w16cex="http://schemas.microsoft.com/office/word/2018/wordml/cex" xmlns:w16cid="http://schemas.microsoft.com/office/word/2016/wordml/cid" xmlns:w16="http://schemas.microsoft.com/office/word/2018/wordml" xmlns:w16du="http://schemas.microsoft.com/office/word/2023/wordml/word16du" xmlns:w16sdtdh="http://schemas.microsoft.com/office/word/2020/wordml/sdtdatahash" xmlns:w16sdtfl="http://schemas.microsoft.com/office/word/2024/wordml/sdtformatlock" xmlns:w16se="http://schemas.microsoft.com/office/word/2015/wordml/symex" xmlns:wpg="http://schemas.microsoft.com/office/word/2010/wordprocessingGroup" xmlns:wpi="http://schemas.microsoft.com/office/word/2010/wordprocessingInk" xmlns:wne="http://schemas.microsoft.com/office/word/2006/wordml" xmlns:wps="http://schemas.microsoft.com/office/word/2010/wordprocessingShape" mc:Ignorable="w14 w15 w16se w16cid w16 w16cex w16sdtdh w16sdtfl w16du wp14">
   <w:footnote w:type="separator" w:id="-1">
     <w:p>
       <w:pPr>
@@ -7276,7 +7364,7 @@
 </file>
 
 <file path=word/header1.xml><?xml version="1.0" encoding="utf-8"?>
-<w:hdr xmlns:wpc="http://schemas.microsoft.com/office/word/2010/wordprocessingCanvas" xmlns:cx="http://schemas.microsoft.com/office/drawing/2014/chartex" xmlns:cx1="http://schemas.microsoft.com/office/drawing/2015/9/8/chartex" xmlns:cx2="http://schemas.microsoft.com/office/drawing/2015/10/21/chartex" xmlns:cx3="http://schemas.microsoft.com/office/drawing/2016/5/9/chartex" xmlns:cx4="http://schemas.microsoft.com/office/drawing/2016/5/10/chartex" xmlns:cx5="http://schemas.microsoft.com/office/drawing/2016/5/11/chartex" xmlns:cx6="http://schemas.microsoft.com/office/drawing/2016/5/12/chartex" xmlns:cx7="http://schemas.microsoft.com/office/drawing/2016/5/13/chartex" xmlns:cx8="http://schemas.microsoft.com/office/drawing/2016/5/14/chartex" xmlns:mc="http://schemas.openxmlformats.org/markup-compatibility/2006" xmlns:aink="http://schemas.microsoft.com/office/drawing/2016/ink" xmlns:am3d="http://schemas.microsoft.com/office/drawing/2017/model3d" xmlns:o="urn:schemas-microsoft-com:office:office" xmlns:r="http://schemas.openxmlformats.org/officeDocument/2006/relationships" xmlns:m="http://schemas.openxmlformats.org/officeDocument/2006/math" xmlns:v="urn:schemas-microsoft-com:vml" xmlns:wp14="http://schemas.microsoft.com/office/word/2010/wordprocessingDrawing" xmlns:wp="http://schemas.openxmlformats.org/drawingml/2006/wordprocessingDrawing" xmlns:w10="urn:schemas-microsoft-com:office:word" xmlns:w="http://schemas.openxmlformats.org/wordprocessingml/2006/main" xmlns:w14="http://schemas.microsoft.com/office/word/2010/wordml" xmlns:w15="http://schemas.microsoft.com/office/word/2012/wordml" xmlns:w16cex="http://schemas.microsoft.com/office/word/2018/wordml/cex" xmlns:w16cid="http://schemas.microsoft.com/office/word/2016/wordml/cid" xmlns:w16="http://schemas.microsoft.com/office/word/2018/wordml" xmlns:w16sdtdh="http://schemas.microsoft.com/office/word/2020/wordml/sdtdatahash" xmlns:w16se="http://schemas.microsoft.com/office/word/2015/wordml/symex" xmlns:wpg="http://schemas.microsoft.com/office/word/2010/wordprocessingGroup" xmlns:wpi="http://schemas.microsoft.com/office/word/2010/wordprocessingInk" xmlns:wne="http://schemas.microsoft.com/office/word/2006/wordml" xmlns:wps="http://schemas.microsoft.com/office/word/2010/wordprocessingShape" mc:Ignorable="w14 w15 w16se w16cid w16 w16cex w16sdtdh wp14">
+<w:hdr xmlns:wpc="http://schemas.microsoft.com/office/word/2010/wordprocessingCanvas" xmlns:cx="http://schemas.microsoft.com/office/drawing/2014/chartex" xmlns:cx1="http://schemas.microsoft.com/office/drawing/2015/9/8/chartex" xmlns:cx2="http://schemas.microsoft.com/office/drawing/2015/10/21/chartex" xmlns:cx3="http://schemas.microsoft.com/office/drawing/2016/5/9/chartex" xmlns:cx4="http://schemas.microsoft.com/office/drawing/2016/5/10/chartex" xmlns:cx5="http://schemas.microsoft.com/office/drawing/2016/5/11/chartex" xmlns:cx6="http://schemas.microsoft.com/office/drawing/2016/5/12/chartex" xmlns:cx7="http://schemas.microsoft.com/office/drawing/2016/5/13/chartex" xmlns:cx8="http://schemas.microsoft.com/office/drawing/2016/5/14/chartex" xmlns:mc="http://schemas.openxmlformats.org/markup-compatibility/2006" xmlns:aink="http://schemas.microsoft.com/office/drawing/2016/ink" xmlns:am3d="http://schemas.microsoft.com/office/drawing/2017/model3d" xmlns:o="urn:schemas-microsoft-com:office:office" xmlns:oel="http://schemas.microsoft.com/office/2019/extlst" xmlns:r="http://schemas.openxmlformats.org/officeDocument/2006/relationships" xmlns:m="http://schemas.openxmlformats.org/officeDocument/2006/math" xmlns:v="urn:schemas-microsoft-com:vml" xmlns:wp14="http://schemas.microsoft.com/office/word/2010/wordprocessingDrawing" xmlns:wp="http://schemas.openxmlformats.org/drawingml/2006/wordprocessingDrawing" xmlns:w10="urn:schemas-microsoft-com:office:word" xmlns:w="http://schemas.openxmlformats.org/wordprocessingml/2006/main" xmlns:w14="http://schemas.microsoft.com/office/word/2010/wordml" xmlns:w15="http://schemas.microsoft.com/office/word/2012/wordml" xmlns:w16cex="http://schemas.microsoft.com/office/word/2018/wordml/cex" xmlns:w16cid="http://schemas.microsoft.com/office/word/2016/wordml/cid" xmlns:w16="http://schemas.microsoft.com/office/word/2018/wordml" xmlns:w16du="http://schemas.microsoft.com/office/word/2023/wordml/word16du" xmlns:w16sdtdh="http://schemas.microsoft.com/office/word/2020/wordml/sdtdatahash" xmlns:w16sdtfl="http://schemas.microsoft.com/office/word/2024/wordml/sdtformatlock" xmlns:w16se="http://schemas.microsoft.com/office/word/2015/wordml/symex" xmlns:wpg="http://schemas.microsoft.com/office/word/2010/wordprocessingGroup" xmlns:wpi="http://schemas.microsoft.com/office/word/2010/wordprocessingInk" xmlns:wne="http://schemas.microsoft.com/office/word/2006/wordml" xmlns:wps="http://schemas.microsoft.com/office/word/2010/wordprocessingShape" mc:Ignorable="w14 w15 w16se w16cid w16 w16cex w16sdtdh w16sdtfl w16du wp14">
   <w:p>
     <w:pPr>
       <w:pStyle w:val="Encabezado"/>
@@ -7286,7 +7374,7 @@
 </file>
 
 <file path=word/header2.xml><?xml version="1.0" encoding="utf-8"?>
-<w:hdr xmlns:wpc="http://schemas.microsoft.com/office/word/2010/wordprocessingCanvas" xmlns:cx="http://schemas.microsoft.com/office/drawing/2014/chartex" xmlns:cx1="http://schemas.microsoft.com/office/drawing/2015/9/8/chartex" xmlns:cx2="http://schemas.microsoft.com/office/drawing/2015/10/21/chartex" xmlns:cx3="http://schemas.microsoft.com/office/drawing/2016/5/9/chartex" xmlns:cx4="http://schemas.microsoft.com/office/drawing/2016/5/10/chartex" xmlns:cx5="http://schemas.microsoft.com/office/drawing/2016/5/11/chartex" xmlns:cx6="http://schemas.microsoft.com/office/drawing/2016/5/12/chartex" xmlns:cx7="http://schemas.microsoft.com/office/drawing/2016/5/13/chartex" xmlns:cx8="http://schemas.microsoft.com/office/drawing/2016/5/14/chartex" xmlns:mc="http://schemas.openxmlformats.org/markup-compatibility/2006" xmlns:aink="http://schemas.microsoft.com/office/drawing/2016/ink" xmlns:am3d="http://schemas.microsoft.com/office/drawing/2017/model3d" xmlns:o="urn:schemas-microsoft-com:office:office" xmlns:r="http://schemas.openxmlformats.org/officeDocument/2006/relationships" xmlns:m="http://schemas.openxmlformats.org/officeDocument/2006/math" xmlns:v="urn:schemas-microsoft-com:vml" xmlns:wp14="http://schemas.microsoft.com/office/word/2010/wordprocessingDrawing" xmlns:wp="http://schemas.openxmlformats.org/drawingml/2006/wordprocessingDrawing" xmlns:w10="urn:schemas-microsoft-com:office:word" xmlns:w="http://schemas.openxmlformats.org/wordprocessingml/2006/main" xmlns:w14="http://schemas.microsoft.com/office/word/2010/wordml" xmlns:w15="http://schemas.microsoft.com/office/word/2012/wordml" xmlns:w16cex="http://schemas.microsoft.com/office/word/2018/wordml/cex" xmlns:w16cid="http://schemas.microsoft.com/office/word/2016/wordml/cid" xmlns:w16="http://schemas.microsoft.com/office/word/2018/wordml" xmlns:w16sdtdh="http://schemas.microsoft.com/office/word/2020/wordml/sdtdatahash" xmlns:w16se="http://schemas.microsoft.com/office/word/2015/wordml/symex" xmlns:wpg="http://schemas.microsoft.com/office/word/2010/wordprocessingGroup" xmlns:wpi="http://schemas.microsoft.com/office/word/2010/wordprocessingInk" xmlns:wne="http://schemas.microsoft.com/office/word/2006/wordml" xmlns:wps="http://schemas.microsoft.com/office/word/2010/wordprocessingShape" mc:Ignorable="w14 w15 w16se w16cid w16 w16cex w16sdtdh wp14">
+<w:hdr xmlns:wpc="http://schemas.microsoft.com/office/word/2010/wordprocessingCanvas" xmlns:cx="http://schemas.microsoft.com/office/drawing/2014/chartex" xmlns:cx1="http://schemas.microsoft.com/office/drawing/2015/9/8/chartex" xmlns:cx2="http://schemas.microsoft.com/office/drawing/2015/10/21/chartex" xmlns:cx3="http://schemas.microsoft.com/office/drawing/2016/5/9/chartex" xmlns:cx4="http://schemas.microsoft.com/office/drawing/2016/5/10/chartex" xmlns:cx5="http://schemas.microsoft.com/office/drawing/2016/5/11/chartex" xmlns:cx6="http://schemas.microsoft.com/office/drawing/2016/5/12/chartex" xmlns:cx7="http://schemas.microsoft.com/office/drawing/2016/5/13/chartex" xmlns:cx8="http://schemas.microsoft.com/office/drawing/2016/5/14/chartex" xmlns:mc="http://schemas.openxmlformats.org/markup-compatibility/2006" xmlns:aink="http://schemas.microsoft.com/office/drawing/2016/ink" xmlns:am3d="http://schemas.microsoft.com/office/drawing/2017/model3d" xmlns:o="urn:schemas-microsoft-com:office:office" xmlns:oel="http://schemas.microsoft.com/office/2019/extlst" xmlns:r="http://schemas.openxmlformats.org/officeDocument/2006/relationships" xmlns:m="http://schemas.openxmlformats.org/officeDocument/2006/math" xmlns:v="urn:schemas-microsoft-com:vml" xmlns:wp14="http://schemas.microsoft.com/office/word/2010/wordprocessingDrawing" xmlns:wp="http://schemas.openxmlformats.org/drawingml/2006/wordprocessingDrawing" xmlns:w10="urn:schemas-microsoft-com:office:word" xmlns:w="http://schemas.openxmlformats.org/wordprocessingml/2006/main" xmlns:w14="http://schemas.microsoft.com/office/word/2010/wordml" xmlns:w15="http://schemas.microsoft.com/office/word/2012/wordml" xmlns:w16cex="http://schemas.microsoft.com/office/word/2018/wordml/cex" xmlns:w16cid="http://schemas.microsoft.com/office/word/2016/wordml/cid" xmlns:w16="http://schemas.microsoft.com/office/word/2018/wordml" xmlns:w16du="http://schemas.microsoft.com/office/word/2023/wordml/word16du" xmlns:w16sdtdh="http://schemas.microsoft.com/office/word/2020/wordml/sdtdatahash" xmlns:w16sdtfl="http://schemas.microsoft.com/office/word/2024/wordml/sdtformatlock" xmlns:w16se="http://schemas.microsoft.com/office/word/2015/wordml/symex" xmlns:wpg="http://schemas.microsoft.com/office/word/2010/wordprocessingGroup" xmlns:wpi="http://schemas.microsoft.com/office/word/2010/wordprocessingInk" xmlns:wne="http://schemas.microsoft.com/office/word/2006/wordml" xmlns:wps="http://schemas.microsoft.com/office/word/2010/wordprocessingShape" mc:Ignorable="w14 w15 w16se w16cid w16 w16cex w16sdtdh w16sdtfl w16du wp14">
   <w:p>
     <w:pPr>
       <w:pStyle w:val="Encabezado"/>
@@ -7296,7 +7384,7 @@
 </file>
 
 <file path=word/header3.xml><?xml version="1.0" encoding="utf-8"?>
-<w:hdr xmlns:wpc="http://schemas.microsoft.com/office/word/2010/wordprocessingCanvas" xmlns:cx="http://schemas.microsoft.com/office/drawing/2014/chartex" xmlns:cx1="http://schemas.microsoft.com/office/drawing/2015/9/8/chartex" xmlns:cx2="http://schemas.microsoft.com/office/drawing/2015/10/21/chartex" xmlns:cx3="http://schemas.microsoft.com/office/drawing/2016/5/9/chartex" xmlns:cx4="http://schemas.microsoft.com/office/drawing/2016/5/10/chartex" xmlns:cx5="http://schemas.microsoft.com/office/drawing/2016/5/11/chartex" xmlns:cx6="http://schemas.microsoft.com/office/drawing/2016/5/12/chartex" xmlns:cx7="http://schemas.microsoft.com/office/drawing/2016/5/13/chartex" xmlns:cx8="http://schemas.microsoft.com/office/drawing/2016/5/14/chartex" xmlns:mc="http://schemas.openxmlformats.org/markup-compatibility/2006" xmlns:aink="http://schemas.microsoft.com/office/drawing/2016/ink" xmlns:am3d="http://schemas.microsoft.com/office/drawing/2017/model3d" xmlns:o="urn:schemas-microsoft-com:office:office" xmlns:r="http://schemas.openxmlformats.org/officeDocument/2006/relationships" xmlns:m="http://schemas.openxmlformats.org/officeDocument/2006/math" xmlns:v="urn:schemas-microsoft-com:vml" xmlns:wp14="http://schemas.microsoft.com/office/word/2010/wordprocessingDrawing" xmlns:wp="http://schemas.openxmlformats.org/drawingml/2006/wordprocessingDrawing" xmlns:w10="urn:schemas-microsoft-com:office:word" xmlns:w="http://schemas.openxmlformats.org/wordprocessingml/2006/main" xmlns:w14="http://schemas.microsoft.com/office/word/2010/wordml" xmlns:w15="http://schemas.microsoft.com/office/word/2012/wordml" xmlns:w16cex="http://schemas.microsoft.com/office/word/2018/wordml/cex" xmlns:w16cid="http://schemas.microsoft.com/office/word/2016/wordml/cid" xmlns:w16="http://schemas.microsoft.com/office/word/2018/wordml" xmlns:w16sdtdh="http://schemas.microsoft.com/office/word/2020/wordml/sdtdatahash" xmlns:w16se="http://schemas.microsoft.com/office/word/2015/wordml/symex" xmlns:wpg="http://schemas.microsoft.com/office/word/2010/wordprocessingGroup" xmlns:wpi="http://schemas.microsoft.com/office/word/2010/wordprocessingInk" xmlns:wne="http://schemas.microsoft.com/office/word/2006/wordml" xmlns:wps="http://schemas.microsoft.com/office/word/2010/wordprocessingShape" mc:Ignorable="w14 w15 w16se w16cid w16 w16cex w16sdtdh wp14">
+<w:hdr xmlns:wpc="http://schemas.microsoft.com/office/word/2010/wordprocessingCanvas" xmlns:cx="http://schemas.microsoft.com/office/drawing/2014/chartex" xmlns:cx1="http://schemas.microsoft.com/office/drawing/2015/9/8/chartex" xmlns:cx2="http://schemas.microsoft.com/office/drawing/2015/10/21/chartex" xmlns:cx3="http://schemas.microsoft.com/office/drawing/2016/5/9/chartex" xmlns:cx4="http://schemas.microsoft.com/office/drawing/2016/5/10/chartex" xmlns:cx5="http://schemas.microsoft.com/office/drawing/2016/5/11/chartex" xmlns:cx6="http://schemas.microsoft.com/office/drawing/2016/5/12/chartex" xmlns:cx7="http://schemas.microsoft.com/office/drawing/2016/5/13/chartex" xmlns:cx8="http://schemas.microsoft.com/office/drawing/2016/5/14/chartex" xmlns:mc="http://schemas.openxmlformats.org/markup-compatibility/2006" xmlns:aink="http://schemas.microsoft.com/office/drawing/2016/ink" xmlns:am3d="http://schemas.microsoft.com/office/drawing/2017/model3d" xmlns:o="urn:schemas-microsoft-com:office:office" xmlns:oel="http://schemas.microsoft.com/office/2019/extlst" xmlns:r="http://schemas.openxmlformats.org/officeDocument/2006/relationships" xmlns:m="http://schemas.openxmlformats.org/officeDocument/2006/math" xmlns:v="urn:schemas-microsoft-com:vml" xmlns:wp14="http://schemas.microsoft.com/office/word/2010/wordprocessingDrawing" xmlns:wp="http://schemas.openxmlformats.org/drawingml/2006/wordprocessingDrawing" xmlns:w10="urn:schemas-microsoft-com:office:word" xmlns:w="http://schemas.openxmlformats.org/wordprocessingml/2006/main" xmlns:w14="http://schemas.microsoft.com/office/word/2010/wordml" xmlns:w15="http://schemas.microsoft.com/office/word/2012/wordml" xmlns:w16cex="http://schemas.microsoft.com/office/word/2018/wordml/cex" xmlns:w16cid="http://schemas.microsoft.com/office/word/2016/wordml/cid" xmlns:w16="http://schemas.microsoft.com/office/word/2018/wordml" xmlns:w16du="http://schemas.microsoft.com/office/word/2023/wordml/word16du" xmlns:w16sdtdh="http://schemas.microsoft.com/office/word/2020/wordml/sdtdatahash" xmlns:w16sdtfl="http://schemas.microsoft.com/office/word/2024/wordml/sdtformatlock" xmlns:w16se="http://schemas.microsoft.com/office/word/2015/wordml/symex" xmlns:wpg="http://schemas.microsoft.com/office/word/2010/wordprocessingGroup" xmlns:wpi="http://schemas.microsoft.com/office/word/2010/wordprocessingInk" xmlns:wne="http://schemas.microsoft.com/office/word/2006/wordml" xmlns:wps="http://schemas.microsoft.com/office/word/2010/wordprocessingShape" mc:Ignorable="w14 w15 w16se w16cid w16 w16cex w16sdtdh w16sdtfl w16du wp14">
   <w:p>
     <w:pPr>
       <w:pStyle w:val="Encabezado"/>
@@ -7306,7 +7394,7 @@
 </file>
 
 <file path=word/header4.xml><?xml version="1.0" encoding="utf-8"?>
-<w:hdr xmlns:wpc="http://schemas.microsoft.com/office/word/2010/wordprocessingCanvas" xmlns:cx="http://schemas.microsoft.com/office/drawing/2014/chartex" xmlns:cx1="http://schemas.microsoft.com/office/drawing/2015/9/8/chartex" xmlns:cx2="http://schemas.microsoft.com/office/drawing/2015/10/21/chartex" xmlns:cx3="http://schemas.microsoft.com/office/drawing/2016/5/9/chartex" xmlns:cx4="http://schemas.microsoft.com/office/drawing/2016/5/10/chartex" xmlns:cx5="http://schemas.microsoft.com/office/drawing/2016/5/11/chartex" xmlns:cx6="http://schemas.microsoft.com/office/drawing/2016/5/12/chartex" xmlns:cx7="http://schemas.microsoft.com/office/drawing/2016/5/13/chartex" xmlns:cx8="http://schemas.microsoft.com/office/drawing/2016/5/14/chartex" xmlns:mc="http://schemas.openxmlformats.org/markup-compatibility/2006" xmlns:aink="http://schemas.microsoft.com/office/drawing/2016/ink" xmlns:am3d="http://schemas.microsoft.com/office/drawing/2017/model3d" xmlns:o="urn:schemas-microsoft-com:office:office" xmlns:r="http://schemas.openxmlformats.org/officeDocument/2006/relationships" xmlns:m="http://schemas.openxmlformats.org/officeDocument/2006/math" xmlns:v="urn:schemas-microsoft-com:vml" xmlns:wp14="http://schemas.microsoft.com/office/word/2010/wordprocessingDrawing" xmlns:wp="http://schemas.openxmlformats.org/drawingml/2006/wordprocessingDrawing" xmlns:w10="urn:schemas-microsoft-com:office:word" xmlns:w="http://schemas.openxmlformats.org/wordprocessingml/2006/main" xmlns:w14="http://schemas.microsoft.com/office/word/2010/wordml" xmlns:w15="http://schemas.microsoft.com/office/word/2012/wordml" xmlns:w16cex="http://schemas.microsoft.com/office/word/2018/wordml/cex" xmlns:w16cid="http://schemas.microsoft.com/office/word/2016/wordml/cid" xmlns:w16="http://schemas.microsoft.com/office/word/2018/wordml" xmlns:w16sdtdh="http://schemas.microsoft.com/office/word/2020/wordml/sdtdatahash" xmlns:w16se="http://schemas.microsoft.com/office/word/2015/wordml/symex" xmlns:wpg="http://schemas.microsoft.com/office/word/2010/wordprocessingGroup" xmlns:wpi="http://schemas.microsoft.com/office/word/2010/wordprocessingInk" xmlns:wne="http://schemas.microsoft.com/office/word/2006/wordml" xmlns:wps="http://schemas.microsoft.com/office/word/2010/wordprocessingShape" mc:Ignorable="w14 w15 w16se w16cid w16 w16cex w16sdtdh wp14">
+<w:hdr xmlns:wpc="http://schemas.microsoft.com/office/word/2010/wordprocessingCanvas" xmlns:cx="http://schemas.microsoft.com/office/drawing/2014/chartex" xmlns:cx1="http://schemas.microsoft.com/office/drawing/2015/9/8/chartex" xmlns:cx2="http://schemas.microsoft.com/office/drawing/2015/10/21/chartex" xmlns:cx3="http://schemas.microsoft.com/office/drawing/2016/5/9/chartex" xmlns:cx4="http://schemas.microsoft.com/office/drawing/2016/5/10/chartex" xmlns:cx5="http://schemas.microsoft.com/office/drawing/2016/5/11/chartex" xmlns:cx6="http://schemas.microsoft.com/office/drawing/2016/5/12/chartex" xmlns:cx7="http://schemas.microsoft.com/office/drawing/2016/5/13/chartex" xmlns:cx8="http://schemas.microsoft.com/office/drawing/2016/5/14/chartex" xmlns:mc="http://schemas.openxmlformats.org/markup-compatibility/2006" xmlns:aink="http://schemas.microsoft.com/office/drawing/2016/ink" xmlns:am3d="http://schemas.microsoft.com/office/drawing/2017/model3d" xmlns:o="urn:schemas-microsoft-com:office:office" xmlns:oel="http://schemas.microsoft.com/office/2019/extlst" xmlns:r="http://schemas.openxmlformats.org/officeDocument/2006/relationships" xmlns:m="http://schemas.openxmlformats.org/officeDocument/2006/math" xmlns:v="urn:schemas-microsoft-com:vml" xmlns:wp14="http://schemas.microsoft.com/office/word/2010/wordprocessingDrawing" xmlns:wp="http://schemas.openxmlformats.org/drawingml/2006/wordprocessingDrawing" xmlns:w10="urn:schemas-microsoft-com:office:word" xmlns:w="http://schemas.openxmlformats.org/wordprocessingml/2006/main" xmlns:w14="http://schemas.microsoft.com/office/word/2010/wordml" xmlns:w15="http://schemas.microsoft.com/office/word/2012/wordml" xmlns:w16cex="http://schemas.microsoft.com/office/word/2018/wordml/cex" xmlns:w16cid="http://schemas.microsoft.com/office/word/2016/wordml/cid" xmlns:w16="http://schemas.microsoft.com/office/word/2018/wordml" xmlns:w16du="http://schemas.microsoft.com/office/word/2023/wordml/word16du" xmlns:w16sdtdh="http://schemas.microsoft.com/office/word/2020/wordml/sdtdatahash" xmlns:w16sdtfl="http://schemas.microsoft.com/office/word/2024/wordml/sdtformatlock" xmlns:w16se="http://schemas.microsoft.com/office/word/2015/wordml/symex" xmlns:wpg="http://schemas.microsoft.com/office/word/2010/wordprocessingGroup" xmlns:wpi="http://schemas.microsoft.com/office/word/2010/wordprocessingInk" xmlns:wne="http://schemas.microsoft.com/office/word/2006/wordml" xmlns:wps="http://schemas.microsoft.com/office/word/2010/wordprocessingShape" mc:Ignorable="w14 w15 w16se w16cid w16 w16cex w16sdtdh w16sdtfl w16du wp14">
   <w:p>
     <w:pPr>
       <w:pStyle w:val="Encabezado"/>
@@ -7392,7 +7480,7 @@
 </file>
 
 <file path=word/numbering.xml><?xml version="1.0" encoding="utf-8"?>
-<w:numbering xmlns:wpc="http://schemas.microsoft.com/office/word/2010/wordprocessingCanvas" xmlns:cx="http://schemas.microsoft.com/office/drawing/2014/chartex" xmlns:cx1="http://schemas.microsoft.com/office/drawing/2015/9/8/chartex" xmlns:cx2="http://schemas.microsoft.com/office/drawing/2015/10/21/chartex" xmlns:cx3="http://schemas.microsoft.com/office/drawing/2016/5/9/chartex" xmlns:cx4="http://schemas.microsoft.com/office/drawing/2016/5/10/chartex" xmlns:cx5="http://schemas.microsoft.com/office/drawing/2016/5/11/chartex" xmlns:cx6="http://schemas.microsoft.com/office/drawing/2016/5/12/chartex" xmlns:cx7="http://schemas.microsoft.com/office/drawing/2016/5/13/chartex" xmlns:cx8="http://schemas.microsoft.com/office/drawing/2016/5/14/chartex" xmlns:mc="http://schemas.openxmlformats.org/markup-compatibility/2006" xmlns:aink="http://schemas.microsoft.com/office/drawing/2016/ink" xmlns:am3d="http://schemas.microsoft.com/office/drawing/2017/model3d" xmlns:o="urn:schemas-microsoft-com:office:office" xmlns:r="http://schemas.openxmlformats.org/officeDocument/2006/relationships" xmlns:m="http://schemas.openxmlformats.org/officeDocument/2006/math" xmlns:v="urn:schemas-microsoft-com:vml" xmlns:wp14="http://schemas.microsoft.com/office/word/2010/wordprocessingDrawing" xmlns:wp="http://schemas.openxmlformats.org/drawingml/2006/wordprocessingDrawing" xmlns:w10="urn:schemas-microsoft-com:office:word" xmlns:w="http://schemas.openxmlformats.org/wordprocessingml/2006/main" xmlns:w14="http://schemas.microsoft.com/office/word/2010/wordml" xmlns:w15="http://schemas.microsoft.com/office/word/2012/wordml" xmlns:w16cex="http://schemas.microsoft.com/office/word/2018/wordml/cex" xmlns:w16cid="http://schemas.microsoft.com/office/word/2016/wordml/cid" xmlns:w16="http://schemas.microsoft.com/office/word/2018/wordml" xmlns:w16sdtdh="http://schemas.microsoft.com/office/word/2020/wordml/sdtdatahash" xmlns:w16se="http://schemas.microsoft.com/office/word/2015/wordml/symex" xmlns:wpg="http://schemas.microsoft.com/office/word/2010/wordprocessingGroup" xmlns:wpi="http://schemas.microsoft.com/office/word/2010/wordprocessingInk" xmlns:wne="http://schemas.microsoft.com/office/word/2006/wordml" xmlns:wps="http://schemas.microsoft.com/office/word/2010/wordprocessingShape" mc:Ignorable="w14 w15 w16se w16cid w16 w16cex w16sdtdh wp14">
+<w:numbering xmlns:wpc="http://schemas.microsoft.com/office/word/2010/wordprocessingCanvas" xmlns:cx="http://schemas.microsoft.com/office/drawing/2014/chartex" xmlns:cx1="http://schemas.microsoft.com/office/drawing/2015/9/8/chartex" xmlns:cx2="http://schemas.microsoft.com/office/drawing/2015/10/21/chartex" xmlns:cx3="http://schemas.microsoft.com/office/drawing/2016/5/9/chartex" xmlns:cx4="http://schemas.microsoft.com/office/drawing/2016/5/10/chartex" xmlns:cx5="http://schemas.microsoft.com/office/drawing/2016/5/11/chartex" xmlns:cx6="http://schemas.microsoft.com/office/drawing/2016/5/12/chartex" xmlns:cx7="http://schemas.microsoft.com/office/drawing/2016/5/13/chartex" xmlns:cx8="http://schemas.microsoft.com/office/drawing/2016/5/14/chartex" xmlns:mc="http://schemas.openxmlformats.org/markup-compatibility/2006" xmlns:aink="http://schemas.microsoft.com/office/drawing/2016/ink" xmlns:am3d="http://schemas.microsoft.com/office/drawing/2017/model3d" xmlns:o="urn:schemas-microsoft-com:office:office" xmlns:oel="http://schemas.microsoft.com/office/2019/extlst" xmlns:r="http://schemas.openxmlformats.org/officeDocument/2006/relationships" xmlns:m="http://schemas.openxmlformats.org/officeDocument/2006/math" xmlns:v="urn:schemas-microsoft-com:vml" xmlns:wp14="http://schemas.microsoft.com/office/word/2010/wordprocessingDrawing" xmlns:wp="http://schemas.openxmlformats.org/drawingml/2006/wordprocessingDrawing" xmlns:w10="urn:schemas-microsoft-com:office:word" xmlns:w="http://schemas.openxmlformats.org/wordprocessingml/2006/main" xmlns:w14="http://schemas.microsoft.com/office/word/2010/wordml" xmlns:w15="http://schemas.microsoft.com/office/word/2012/wordml" xmlns:w16cex="http://schemas.microsoft.com/office/word/2018/wordml/cex" xmlns:w16cid="http://schemas.microsoft.com/office/word/2016/wordml/cid" xmlns:w16="http://schemas.microsoft.com/office/word/2018/wordml" xmlns:w16du="http://schemas.microsoft.com/office/word/2023/wordml/word16du" xmlns:w16sdtdh="http://schemas.microsoft.com/office/word/2020/wordml/sdtdatahash" xmlns:w16sdtfl="http://schemas.microsoft.com/office/word/2024/wordml/sdtformatlock" xmlns:w16se="http://schemas.microsoft.com/office/word/2015/wordml/symex" xmlns:wpg="http://schemas.microsoft.com/office/word/2010/wordprocessingGroup" xmlns:wpi="http://schemas.microsoft.com/office/word/2010/wordprocessingInk" xmlns:wne="http://schemas.microsoft.com/office/word/2006/wordml" xmlns:wps="http://schemas.microsoft.com/office/word/2010/wordprocessingShape" mc:Ignorable="w14 w15 w16se w16cid w16 w16cex w16sdtdh w16sdtfl w16du wp14">
   <w:numPicBullet w:numPicBulletId="0">
     <w:pict>
       <v:shapetype id="_x0000_t75" coordsize="21600,21600" o:spt="75" o:preferrelative="t" path="m@4@5l@4@11@9@11@9@5xe" filled="f" stroked="f">
@@ -7414,7 +7502,7 @@
         <v:path o:extrusionok="f" gradientshapeok="t" o:connecttype="rect"/>
         <o:lock v:ext="edit" aspectratio="t"/>
       </v:shapetype>
-      <v:shape id="_x0000_i1052" type="#_x0000_t75" style="width:10.5pt;height:10.5pt" o:bullet="t">
+      <v:shape id="_x0000_i1046" type="#_x0000_t75" style="width:11.35pt;height:11.35pt" o:bullet="t">
         <v:imagedata r:id="rId1" o:title="mso8C56"/>
       </v:shape>
     </w:pict>
@@ -12839,148 +12927,148 @@
       </w:rPr>
     </w:lvl>
   </w:abstractNum>
-  <w:num w:numId="1">
+  <w:num w:numId="1" w16cid:durableId="2058775497">
     <w:abstractNumId w:val="46"/>
   </w:num>
-  <w:num w:numId="2">
+  <w:num w:numId="2" w16cid:durableId="515652553">
     <w:abstractNumId w:val="0"/>
   </w:num>
-  <w:num w:numId="3">
+  <w:num w:numId="3" w16cid:durableId="1418672398">
     <w:abstractNumId w:val="13"/>
   </w:num>
-  <w:num w:numId="4">
+  <w:num w:numId="4" w16cid:durableId="1706756628">
     <w:abstractNumId w:val="30"/>
   </w:num>
-  <w:num w:numId="5">
+  <w:num w:numId="5" w16cid:durableId="2002923160">
     <w:abstractNumId w:val="17"/>
   </w:num>
-  <w:num w:numId="6">
+  <w:num w:numId="6" w16cid:durableId="2043355309">
     <w:abstractNumId w:val="8"/>
   </w:num>
-  <w:num w:numId="7">
+  <w:num w:numId="7" w16cid:durableId="1987858695">
     <w:abstractNumId w:val="40"/>
   </w:num>
-  <w:num w:numId="8">
+  <w:num w:numId="8" w16cid:durableId="822310530">
     <w:abstractNumId w:val="24"/>
   </w:num>
-  <w:num w:numId="9">
+  <w:num w:numId="9" w16cid:durableId="497621629">
     <w:abstractNumId w:val="26"/>
   </w:num>
-  <w:num w:numId="10">
+  <w:num w:numId="10" w16cid:durableId="612445459">
     <w:abstractNumId w:val="47"/>
   </w:num>
-  <w:num w:numId="11">
+  <w:num w:numId="11" w16cid:durableId="962921955">
     <w:abstractNumId w:val="43"/>
   </w:num>
-  <w:num w:numId="12">
+  <w:num w:numId="12" w16cid:durableId="276257335">
     <w:abstractNumId w:val="2"/>
   </w:num>
-  <w:num w:numId="13">
+  <w:num w:numId="13" w16cid:durableId="684600939">
     <w:abstractNumId w:val="25"/>
   </w:num>
-  <w:num w:numId="14">
+  <w:num w:numId="14" w16cid:durableId="577909840">
     <w:abstractNumId w:val="29"/>
   </w:num>
-  <w:num w:numId="15">
+  <w:num w:numId="15" w16cid:durableId="763915031">
     <w:abstractNumId w:val="31"/>
   </w:num>
-  <w:num w:numId="16">
+  <w:num w:numId="16" w16cid:durableId="1918201702">
     <w:abstractNumId w:val="15"/>
   </w:num>
-  <w:num w:numId="17">
+  <w:num w:numId="17" w16cid:durableId="334305672">
     <w:abstractNumId w:val="12"/>
   </w:num>
-  <w:num w:numId="18">
+  <w:num w:numId="18" w16cid:durableId="1521355960">
     <w:abstractNumId w:val="38"/>
   </w:num>
-  <w:num w:numId="19">
+  <w:num w:numId="19" w16cid:durableId="830294763">
     <w:abstractNumId w:val="44"/>
   </w:num>
-  <w:num w:numId="20">
+  <w:num w:numId="20" w16cid:durableId="56629900">
     <w:abstractNumId w:val="14"/>
   </w:num>
-  <w:num w:numId="21">
+  <w:num w:numId="21" w16cid:durableId="1825391151">
     <w:abstractNumId w:val="42"/>
   </w:num>
-  <w:num w:numId="22">
+  <w:num w:numId="22" w16cid:durableId="690306455">
     <w:abstractNumId w:val="11"/>
   </w:num>
-  <w:num w:numId="23">
+  <w:num w:numId="23" w16cid:durableId="393427169">
     <w:abstractNumId w:val="19"/>
   </w:num>
-  <w:num w:numId="24">
+  <w:num w:numId="24" w16cid:durableId="1539274703">
     <w:abstractNumId w:val="45"/>
   </w:num>
-  <w:num w:numId="25">
+  <w:num w:numId="25" w16cid:durableId="1746300332">
     <w:abstractNumId w:val="3"/>
   </w:num>
-  <w:num w:numId="26">
+  <w:num w:numId="26" w16cid:durableId="1125539418">
     <w:abstractNumId w:val="32"/>
   </w:num>
-  <w:num w:numId="27">
+  <w:num w:numId="27" w16cid:durableId="373893199">
     <w:abstractNumId w:val="33"/>
   </w:num>
-  <w:num w:numId="28">
+  <w:num w:numId="28" w16cid:durableId="715545996">
     <w:abstractNumId w:val="23"/>
   </w:num>
-  <w:num w:numId="29">
+  <w:num w:numId="29" w16cid:durableId="241526116">
     <w:abstractNumId w:val="41"/>
   </w:num>
-  <w:num w:numId="30">
+  <w:num w:numId="30" w16cid:durableId="1357929814">
     <w:abstractNumId w:val="27"/>
   </w:num>
-  <w:num w:numId="31">
+  <w:num w:numId="31" w16cid:durableId="225266227">
     <w:abstractNumId w:val="16"/>
   </w:num>
-  <w:num w:numId="32">
+  <w:num w:numId="32" w16cid:durableId="1566838198">
     <w:abstractNumId w:val="20"/>
   </w:num>
-  <w:num w:numId="33">
+  <w:num w:numId="33" w16cid:durableId="706561328">
     <w:abstractNumId w:val="28"/>
   </w:num>
-  <w:num w:numId="34">
+  <w:num w:numId="34" w16cid:durableId="1323505828">
     <w:abstractNumId w:val="7"/>
   </w:num>
-  <w:num w:numId="35">
+  <w:num w:numId="35" w16cid:durableId="394352808">
     <w:abstractNumId w:val="39"/>
   </w:num>
-  <w:num w:numId="36">
+  <w:num w:numId="36" w16cid:durableId="75366691">
     <w:abstractNumId w:val="10"/>
   </w:num>
-  <w:num w:numId="37">
+  <w:num w:numId="37" w16cid:durableId="1764111269">
     <w:abstractNumId w:val="4"/>
   </w:num>
-  <w:num w:numId="38">
+  <w:num w:numId="38" w16cid:durableId="1656956847">
     <w:abstractNumId w:val="5"/>
   </w:num>
-  <w:num w:numId="39">
+  <w:num w:numId="39" w16cid:durableId="402722744">
     <w:abstractNumId w:val="34"/>
   </w:num>
-  <w:num w:numId="40">
+  <w:num w:numId="40" w16cid:durableId="972830491">
     <w:abstractNumId w:val="35"/>
   </w:num>
-  <w:num w:numId="41">
+  <w:num w:numId="41" w16cid:durableId="1687561159">
     <w:abstractNumId w:val="37"/>
   </w:num>
-  <w:num w:numId="42">
+  <w:num w:numId="42" w16cid:durableId="1076395526">
     <w:abstractNumId w:val="18"/>
   </w:num>
-  <w:num w:numId="43">
+  <w:num w:numId="43" w16cid:durableId="1197160634">
     <w:abstractNumId w:val="6"/>
   </w:num>
-  <w:num w:numId="44">
+  <w:num w:numId="44" w16cid:durableId="1186213277">
     <w:abstractNumId w:val="1"/>
   </w:num>
-  <w:num w:numId="45">
+  <w:num w:numId="45" w16cid:durableId="807862899">
     <w:abstractNumId w:val="9"/>
   </w:num>
-  <w:num w:numId="46">
+  <w:num w:numId="46" w16cid:durableId="1836801596">
     <w:abstractNumId w:val="36"/>
   </w:num>
-  <w:num w:numId="47">
+  <w:num w:numId="47" w16cid:durableId="1449012188">
     <w:abstractNumId w:val="21"/>
   </w:num>
-  <w:num w:numId="48">
+  <w:num w:numId="48" w16cid:durableId="1808668851">
     <w:abstractNumId w:val="22"/>
   </w:num>
   <w:numIdMacAtCleanup w:val="23"/>
@@ -12988,7 +13076,7 @@
 </file>
 
 <file path=word/styles.xml><?xml version="1.0" encoding="utf-8"?>
-<w:styles xmlns:mc="http://schemas.openxmlformats.org/markup-compatibility/2006" xmlns:r="http://schemas.openxmlformats.org/officeDocument/2006/relationships" xmlns:w="http://schemas.openxmlformats.org/wordprocessingml/2006/main" xmlns:w14="http://schemas.microsoft.com/office/word/2010/wordml" xmlns:w15="http://schemas.microsoft.com/office/word/2012/wordml" xmlns:w16cex="http://schemas.microsoft.com/office/word/2018/wordml/cex" xmlns:w16cid="http://schemas.microsoft.com/office/word/2016/wordml/cid" xmlns:w16="http://schemas.microsoft.com/office/word/2018/wordml" xmlns:w16sdtdh="http://schemas.microsoft.com/office/word/2020/wordml/sdtdatahash" xmlns:w16se="http://schemas.microsoft.com/office/word/2015/wordml/symex" mc:Ignorable="w14 w15 w16se w16cid w16 w16cex w16sdtdh">
+<w:styles xmlns:mc="http://schemas.openxmlformats.org/markup-compatibility/2006" xmlns:r="http://schemas.openxmlformats.org/officeDocument/2006/relationships" xmlns:w="http://schemas.openxmlformats.org/wordprocessingml/2006/main" xmlns:w14="http://schemas.microsoft.com/office/word/2010/wordml" xmlns:w15="http://schemas.microsoft.com/office/word/2012/wordml" xmlns:w16cex="http://schemas.microsoft.com/office/word/2018/wordml/cex" xmlns:w16cid="http://schemas.microsoft.com/office/word/2016/wordml/cid" xmlns:w16="http://schemas.microsoft.com/office/word/2018/wordml" xmlns:w16du="http://schemas.microsoft.com/office/word/2023/wordml/word16du" xmlns:w16sdtdh="http://schemas.microsoft.com/office/word/2020/wordml/sdtdatahash" xmlns:w16sdtfl="http://schemas.microsoft.com/office/word/2024/wordml/sdtformatlock" xmlns:w16se="http://schemas.microsoft.com/office/word/2015/wordml/symex" mc:Ignorable="w14 w15 w16se w16cid w16 w16cex w16sdtdh w16sdtfl w16du">
   <w:docDefaults>
     <w:rPrDefault>
       <w:rPr>
@@ -14716,21 +14804,10 @@
 </file>
 
 <file path=customXml/item1.xml><?xml version="1.0" encoding="utf-8"?>
-<p:properties xmlns:p="http://schemas.microsoft.com/office/2006/metadata/properties" xmlns:xsi="http://www.w3.org/2001/XMLSchema-instance" xmlns:pc="http://schemas.microsoft.com/office/infopath/2007/PartnerControls">
-  <documentManagement>
-    <TaxCatchAll xmlns="cb45339b-ced9-4d0d-8f64-77573914d53b" xsi:nil="true"/>
-    <lcf76f155ced4ddcb4097134ff3c332f xmlns="43a3ca16-9c26-4813-b83f-4aec9927b43f">
-      <Terms xmlns="http://schemas.microsoft.com/office/infopath/2007/PartnerControls"/>
-    </lcf76f155ced4ddcb4097134ff3c332f>
-  </documentManagement>
-</p:properties>
+<b:Sources xmlns:b="http://schemas.openxmlformats.org/officeDocument/2006/bibliography" xmlns="http://schemas.openxmlformats.org/officeDocument/2006/bibliography" SelectedStyle="\APASixthEditionOfficeOnline.xsl" StyleName="APA" Version="6"/>
 </file>
 
 <file path=customXml/item2.xml><?xml version="1.0" encoding="utf-8"?>
-<b:Sources xmlns:b="http://schemas.openxmlformats.org/officeDocument/2006/bibliography" xmlns="http://schemas.openxmlformats.org/officeDocument/2006/bibliography" SelectedStyle="\APASixthEditionOfficeOnline.xsl" StyleName="APA" Version="6"/>
-</file>
-
-<file path=customXml/item3.xml><?xml version="1.0" encoding="utf-8"?>
 <?mso-contentType ?>
 <FormTemplates xmlns="http://schemas.microsoft.com/sharepoint/v3/contenttype/forms">
   <Display>DocumentLibraryForm</Display>
@@ -14739,7 +14816,7 @@
 </FormTemplates>
 </file>
 
-<file path=customXml/item4.xml><?xml version="1.0" encoding="utf-8"?>
+<file path=customXml/item3.xml><?xml version="1.0" encoding="utf-8"?>
 <ct:contentTypeSchema xmlns:ct="http://schemas.microsoft.com/office/2006/metadata/contentType" xmlns:ma="http://schemas.microsoft.com/office/2006/metadata/properties/metaAttributes" ct:_="" ma:_="" ma:contentTypeName="Documento" ma:contentTypeID="0x01010049282E1EDBE9234EA9E6D38F720E265F" ma:contentTypeVersion="15" ma:contentTypeDescription="Crear nuevo documento." ma:contentTypeScope="" ma:versionID="b31c7aa9eaf043a08b87120b3c4916e3">
   <xsd:schema xmlns:xsd="http://www.w3.org/2001/XMLSchema" xmlns:xs="http://www.w3.org/2001/XMLSchema" xmlns:p="http://schemas.microsoft.com/office/2006/metadata/properties" xmlns:ns2="cb45339b-ced9-4d0d-8f64-77573914d53b" xmlns:ns3="43a3ca16-9c26-4813-b83f-4aec9927b43f" targetNamespace="http://schemas.microsoft.com/office/2006/metadata/properties" ma:root="true" ma:fieldsID="3533d065b04d75c457075bc55f1f5315" ns2:_="" ns3:_="">
     <xsd:import namespace="cb45339b-ced9-4d0d-8f64-77573914d53b"/>
@@ -14974,18 +15051,18 @@
 </ct:contentTypeSchema>
 </file>
 
-<file path=customXml/itemProps1.xml><?xml version="1.0" encoding="utf-8"?>
-<ds:datastoreItem xmlns:ds="http://schemas.openxmlformats.org/officeDocument/2006/customXml" ds:itemID="{26259216-AD86-464A-AEAD-95B1F9E17392}">
-  <ds:schemaRefs>
-    <ds:schemaRef ds:uri="http://schemas.microsoft.com/office/2006/metadata/properties"/>
-    <ds:schemaRef ds:uri="http://schemas.microsoft.com/office/infopath/2007/PartnerControls"/>
-    <ds:schemaRef ds:uri="cb45339b-ced9-4d0d-8f64-77573914d53b"/>
-    <ds:schemaRef ds:uri="43a3ca16-9c26-4813-b83f-4aec9927b43f"/>
-  </ds:schemaRefs>
-</ds:datastoreItem>
+<file path=customXml/item4.xml><?xml version="1.0" encoding="utf-8"?>
+<p:properties xmlns:p="http://schemas.microsoft.com/office/2006/metadata/properties" xmlns:xsi="http://www.w3.org/2001/XMLSchema-instance" xmlns:pc="http://schemas.microsoft.com/office/infopath/2007/PartnerControls">
+  <documentManagement>
+    <TaxCatchAll xmlns="cb45339b-ced9-4d0d-8f64-77573914d53b" xsi:nil="true"/>
+    <lcf76f155ced4ddcb4097134ff3c332f xmlns="43a3ca16-9c26-4813-b83f-4aec9927b43f">
+      <Terms xmlns="http://schemas.microsoft.com/office/infopath/2007/PartnerControls"/>
+    </lcf76f155ced4ddcb4097134ff3c332f>
+  </documentManagement>
+</p:properties>
 </file>
 
-<file path=customXml/itemProps2.xml><?xml version="1.0" encoding="utf-8"?>
+<file path=customXml/itemProps1.xml><?xml version="1.0" encoding="utf-8"?>
 <ds:datastoreItem xmlns:ds="http://schemas.openxmlformats.org/officeDocument/2006/customXml" ds:itemID="{A9F2CEBA-C824-4C86-81A8-E32CBD0EB92D}">
   <ds:schemaRefs>
     <ds:schemaRef ds:uri="http://schemas.openxmlformats.org/officeDocument/2006/bibliography"/>
@@ -14993,7 +15070,7 @@
 </ds:datastoreItem>
 </file>
 
-<file path=customXml/itemProps3.xml><?xml version="1.0" encoding="utf-8"?>
+<file path=customXml/itemProps2.xml><?xml version="1.0" encoding="utf-8"?>
 <ds:datastoreItem xmlns:ds="http://schemas.openxmlformats.org/officeDocument/2006/customXml" ds:itemID="{D00A4A46-BDBD-48AC-87B9-2BA42D9CC06F}">
   <ds:schemaRefs>
     <ds:schemaRef ds:uri="http://schemas.microsoft.com/sharepoint/v3/contenttype/forms"/>
@@ -15001,7 +15078,7 @@
 </ds:datastoreItem>
 </file>
 
-<file path=customXml/itemProps4.xml><?xml version="1.0" encoding="utf-8"?>
+<file path=customXml/itemProps3.xml><?xml version="1.0" encoding="utf-8"?>
 <ds:datastoreItem xmlns:ds="http://schemas.openxmlformats.org/officeDocument/2006/customXml" ds:itemID="{0BC4A0A4-89EA-4C0C-9011-C1B351E892BC}">
   <ds:schemaRefs>
     <ds:schemaRef ds:uri="http://schemas.microsoft.com/office/2006/metadata/contentType"/>
@@ -15018,4 +15095,15 @@
     <ds:schemaRef ds:uri="http://schemas.microsoft.com/internal/obd"/>
   </ds:schemaRefs>
 </ds:datastoreItem>
+</file>
+
+<file path=customXml/itemProps4.xml><?xml version="1.0" encoding="utf-8"?>
+<ds:datastoreItem xmlns:ds="http://schemas.openxmlformats.org/officeDocument/2006/customXml" ds:itemID="{26259216-AD86-464A-AEAD-95B1F9E17392}">
+  <ds:schemaRefs>
+    <ds:schemaRef ds:uri="http://schemas.microsoft.com/office/2006/metadata/properties"/>
+    <ds:schemaRef ds:uri="http://schemas.microsoft.com/office/infopath/2007/PartnerControls"/>
+    <ds:schemaRef ds:uri="cb45339b-ced9-4d0d-8f64-77573914d53b"/>
+    <ds:schemaRef ds:uri="43a3ca16-9c26-4813-b83f-4aec9927b43f"/>
+  </ds:schemaRefs>
+</ds:datastoreItem>
 </file>
</xml_diff>